<commit_message>
Simplify report: related open VFM models and clear migration steps for PCP wells
Co-authored-by: whitegod123 <whitegod123@users.noreply.github.com>
</commit_message>
<xml_diff>
--- a/开源螺杆泵井神经网络计产模型调研报告.docx
+++ b/开源螺杆泵井神经网络计产模型调研报告.docx
@@ -11,11 +11,11 @@
           <w:rFonts w:ascii="Calibri" w:hAnsi="Calibri" w:eastAsia="黑体"/>
           <w:b/>
           <w:color w:val="1F4E79"/>
-          <w:sz w:val="44"/>
+          <w:sz w:val="40"/>
         </w:rPr>
-        <w:t>开源螺杆泵井神经网络计产模型</w:t>
+        <w:t>螺杆泵井神经网络计产</w:t>
         <w:br/>
-        <w:t>调研报告</w:t>
+        <w:t>相关开源模型与迁移指南</w:t>
       </w:r>
     </w:p>
     <w:p>
@@ -28,9 +28,7 @@
           <w:color w:val="666666"/>
           <w:sz w:val="24"/>
         </w:rPr>
-        <w:t>核心问题：有没有开源的螺杆泵井神经网络计产模型？</w:t>
-        <w:br/>
-        <w:t>结论 · 最接近的开源替代 · 机理辅助三模型 · 自建路径</w:t>
+        <w:t>结论 → 相关开源 → 怎么迁移 → 辅助工具</w:t>
       </w:r>
     </w:p>
     <w:p>
@@ -43,7 +41,7 @@
           <w:color w:val="666666"/>
           <w:sz w:val="21"/>
         </w:rPr>
-        <w:t>2026 年 7 月（文件名：开源螺杆泵井神经网络计产模型调研报告.docx）</w:t>
+        <w:t>2026 年 7 月</w:t>
       </w:r>
     </w:p>
     <w:p/>
@@ -58,28 +56,7 @@
           <w:color w:val="1F4E79"/>
           <w:sz w:val="32"/>
         </w:rPr>
-        <w:t>一、核心结论（请先读这一章）</w:t>
-      </w:r>
-    </w:p>
-    <w:p>
-      <w:pPr>
-        <w:spacing w:after="160"/>
-      </w:pPr>
-      <w:r>
-        <w:rPr>
-          <w:rFonts w:ascii="Calibri" w:hAnsi="Calibri" w:eastAsia="黑体"/>
-          <w:b/>
-          <w:color w:val="1F4E79"/>
-          <w:sz w:val="21"/>
-        </w:rPr>
-        <w:t>【本章概述】</w:t>
-      </w:r>
-      <w:r>
-        <w:rPr>
-          <w:rFonts w:ascii="Calibri" w:hAnsi="Calibri" w:eastAsia="宋体"/>
-          <w:sz w:val="21"/>
-        </w:rPr>
-        <w:t>本章直接回答你要的东西：开源的「螺杆泵井神经网络计产模型」有没有。结论写在最前面，避免再被其他资料冲淡。</w:t>
+        <w:t>一、结论（一句话）</w:t>
       </w:r>
     </w:p>
     <w:p>
@@ -91,10 +68,23 @@
         <w:rPr>
           <w:rFonts w:ascii="Calibri" w:hAnsi="Calibri" w:eastAsia="宋体"/>
           <w:b/>
-          <w:color w:val="C0392B"/>
           <w:sz w:val="21"/>
         </w:rPr>
-        <w:t>结论：截至本报告检索日，公开渠道（GitHub / PyPI / 论文配套代码）中，没有发现专门针对螺杆泵（PCP）井、以神经网络做实时产量计量（虚拟计量）的开源成品模型（即：输入泵转速/扭矩/电流等 → 输出当前油/液产量，且提供可训练代码与说明的项目）。</w:t>
+        <w:t>目前没有专门针对「螺杆泵井」的开源神经网络计产成品；但有一批「工况参数 → 产量」的通用虚拟计量（VFM）开源神经网络，以及人工举升（电潜泵）相关开源，可以迁移到螺杆泵井上使用。迁移的核心只有一件事：把输入特征换成泵工况（转速、扭矩/电流等），用本井试井产量当标签重新训练。</w:t>
+      </w:r>
+    </w:p>
+    <w:p>
+      <w:pPr>
+        <w:pStyle w:val="Heading1"/>
+      </w:pPr>
+      <w:r>
+        <w:rPr>
+          <w:rFonts w:ascii="Calibri" w:hAnsi="Calibri" w:eastAsia="黑体"/>
+          <w:b/>
+          <w:color w:val="1F4E79"/>
+          <w:sz w:val="32"/>
+        </w:rPr>
+        <w:t>二、相关开源模型（按迁移优先级）</w:t>
       </w:r>
     </w:p>
     <w:p>
@@ -108,440 +98,7 @@
           <w:b w:val="0"/>
           <w:sz w:val="21"/>
         </w:rPr>
-        <w:t>检索范围包括英文关键词 progressive cavity pump / PCP + neural / LSTM / machine learning / virtual flow meter / soft sensor / flow rate / metering，以及中文关键词「螺杆泵」「计产」「产量」「神经网络」。与螺杆泵相关的开源项目存在，但用途是资产管理、几何设计、故障诊断，不是神经网络计产。与「人工举升 + 神经网络」最接近的开源是电潜泵（ESP）数字孪生，可作结构参考，仍不是螺杆泵计产。</w:t>
-      </w:r>
-    </w:p>
-    <w:p>
-      <w:pPr>
-        <w:pStyle w:val="Heading2"/>
-      </w:pPr>
-      <w:r>
-        <w:rPr>
-          <w:rFonts w:ascii="Calibri" w:hAnsi="Calibri" w:eastAsia="黑体"/>
-          <w:b/>
-          <w:color w:val="1F4E79"/>
-          <w:sz w:val="26"/>
-        </w:rPr>
-        <w:t>1.1 检索到的螺杆泵相关开源（均非神经网络计产）</w:t>
-      </w:r>
-    </w:p>
-    <w:tbl>
-      <w:tblPr>
-        <w:tblStyle w:val="LightGrid-Accent1"/>
-        <w:tblW w:type="auto" w:w="0"/>
-        <w:jc w:val="center"/>
-        <w:tblLook w:firstColumn="1" w:firstRow="1" w:lastColumn="0" w:lastRow="0" w:noHBand="0" w:noVBand="1" w:val="04A0"/>
-      </w:tblPr>
-      <w:tblGrid>
-        <w:gridCol w:w="2161"/>
-        <w:gridCol w:w="2161"/>
-        <w:gridCol w:w="2161"/>
-        <w:gridCol w:w="2161"/>
-      </w:tblGrid>
-      <w:tr>
-        <w:tc>
-          <w:tcPr>
-            <w:tcW w:type="dxa" w:w="2154"/>
-          </w:tcPr>
-          <w:p>
-            <w:r/>
-            <w:r>
-              <w:rPr>
-                <w:rFonts w:ascii="Calibri" w:hAnsi="Calibri" w:eastAsia="黑体"/>
-                <w:b/>
-                <w:sz w:val="21"/>
-              </w:rPr>
-              <w:t>项目</w:t>
-            </w:r>
-          </w:p>
-        </w:tc>
-        <w:tc>
-          <w:tcPr>
-            <w:tcW w:type="dxa" w:w="2721"/>
-          </w:tcPr>
-          <w:p>
-            <w:r/>
-            <w:r>
-              <w:rPr>
-                <w:rFonts w:ascii="Calibri" w:hAnsi="Calibri" w:eastAsia="黑体"/>
-                <w:b/>
-                <w:sz w:val="21"/>
-              </w:rPr>
-              <w:t>地址</w:t>
-            </w:r>
-          </w:p>
-        </w:tc>
-        <w:tc>
-          <w:tcPr>
-            <w:tcW w:type="dxa" w:w="2835"/>
-          </w:tcPr>
-          <w:p>
-            <w:r/>
-            <w:r>
-              <w:rPr>
-                <w:rFonts w:ascii="Calibri" w:hAnsi="Calibri" w:eastAsia="黑体"/>
-                <w:b/>
-                <w:sz w:val="21"/>
-              </w:rPr>
-              <w:t>实际做什么</w:t>
-            </w:r>
-          </w:p>
-        </w:tc>
-        <w:tc>
-          <w:tcPr>
-            <w:tcW w:type="dxa" w:w="1361"/>
-          </w:tcPr>
-          <w:p>
-            <w:r/>
-            <w:r>
-              <w:rPr>
-                <w:rFonts w:ascii="Calibri" w:hAnsi="Calibri" w:eastAsia="黑体"/>
-                <w:b/>
-                <w:sz w:val="21"/>
-              </w:rPr>
-              <w:t>是否计产NN</w:t>
-            </w:r>
-          </w:p>
-        </w:tc>
-      </w:tr>
-      <w:tr>
-        <w:tc>
-          <w:tcPr>
-            <w:tcW w:type="dxa" w:w="2154"/>
-          </w:tcPr>
-          <w:p>
-            <w:r/>
-            <w:r>
-              <w:rPr>
-                <w:rFonts w:ascii="Calibri" w:hAnsi="Calibri" w:eastAsia="宋体"/>
-                <w:sz w:val="20"/>
-              </w:rPr>
-              <w:t>pump_ai_software（螺杆泵AI软件）</w:t>
-            </w:r>
-          </w:p>
-        </w:tc>
-        <w:tc>
-          <w:tcPr>
-            <w:tcW w:type="dxa" w:w="2721"/>
-          </w:tcPr>
-          <w:p>
-            <w:r/>
-            <w:r>
-              <w:rPr>
-                <w:rFonts w:ascii="Calibri" w:hAnsi="Calibri" w:eastAsia="宋体"/>
-                <w:sz w:val="20"/>
-              </w:rPr>
-              <w:t>github.com/xiansurfer/pump_ai_software</w:t>
-            </w:r>
-          </w:p>
-        </w:tc>
-        <w:tc>
-          <w:tcPr>
-            <w:tcW w:type="dxa" w:w="2835"/>
-          </w:tcPr>
-          <w:p>
-            <w:r/>
-            <w:r>
-              <w:rPr>
-                <w:rFonts w:ascii="Calibri" w:hAnsi="Calibri" w:eastAsia="宋体"/>
-                <w:sz w:val="20"/>
-              </w:rPr>
-              <w:t>宏观控制图（扭矩/泵效）、故障预警、生存分析；国内油田电泵/螺杆泵故障数据</w:t>
-            </w:r>
-          </w:p>
-        </w:tc>
-        <w:tc>
-          <w:tcPr>
-            <w:tcW w:type="dxa" w:w="1361"/>
-          </w:tcPr>
-          <w:p>
-            <w:r/>
-            <w:r>
-              <w:rPr>
-                <w:rFonts w:ascii="Calibri" w:hAnsi="Calibri" w:eastAsia="宋体"/>
-                <w:sz w:val="20"/>
-              </w:rPr>
-              <w:t>否（故障诊断，非产量计量）</w:t>
-            </w:r>
-          </w:p>
-        </w:tc>
-      </w:tr>
-      <w:tr>
-        <w:tc>
-          <w:tcPr>
-            <w:tcW w:type="dxa" w:w="2154"/>
-          </w:tcPr>
-          <w:p>
-            <w:r/>
-            <w:r>
-              <w:rPr>
-                <w:rFonts w:ascii="Calibri" w:hAnsi="Calibri" w:eastAsia="宋体"/>
-                <w:sz w:val="20"/>
-              </w:rPr>
-              <w:t>ScrewPumpCalculator</w:t>
-            </w:r>
-          </w:p>
-        </w:tc>
-        <w:tc>
-          <w:tcPr>
-            <w:tcW w:type="dxa" w:w="2721"/>
-          </w:tcPr>
-          <w:p>
-            <w:r/>
-            <w:r>
-              <w:rPr>
-                <w:rFonts w:ascii="Calibri" w:hAnsi="Calibri" w:eastAsia="宋体"/>
-                <w:sz w:val="20"/>
-              </w:rPr>
-              <w:t>github.com/aiguoli/ScrewPumpCalculator</w:t>
-            </w:r>
-          </w:p>
-        </w:tc>
-        <w:tc>
-          <w:tcPr>
-            <w:tcW w:type="dxa" w:w="2835"/>
-          </w:tcPr>
-          <w:p>
-            <w:r/>
-            <w:r>
-              <w:rPr>
-                <w:rFonts w:ascii="Calibri" w:hAnsi="Calibri" w:eastAsia="宋体"/>
-                <w:sz w:val="20"/>
-              </w:rPr>
-              <w:t>螺杆泵参数计算与型线设计（SolidWorks 二次开发）</w:t>
-            </w:r>
-          </w:p>
-        </w:tc>
-        <w:tc>
-          <w:tcPr>
-            <w:tcW w:type="dxa" w:w="1361"/>
-          </w:tcPr>
-          <w:p>
-            <w:r/>
-            <w:r>
-              <w:rPr>
-                <w:rFonts w:ascii="Calibri" w:hAnsi="Calibri" w:eastAsia="宋体"/>
-                <w:sz w:val="20"/>
-              </w:rPr>
-              <w:t>否（几何设计）</w:t>
-            </w:r>
-          </w:p>
-        </w:tc>
-      </w:tr>
-      <w:tr>
-        <w:tc>
-          <w:tcPr>
-            <w:tcW w:type="dxa" w:w="2154"/>
-          </w:tcPr>
-          <w:p>
-            <w:r/>
-            <w:r>
-              <w:rPr>
-                <w:rFonts w:ascii="Calibri" w:hAnsi="Calibri" w:eastAsia="宋体"/>
-                <w:sz w:val="20"/>
-              </w:rPr>
-              <w:t>PCP-Tracker-Project</w:t>
-            </w:r>
-          </w:p>
-        </w:tc>
-        <w:tc>
-          <w:tcPr>
-            <w:tcW w:type="dxa" w:w="2721"/>
-          </w:tcPr>
-          <w:p>
-            <w:r/>
-            <w:r>
-              <w:rPr>
-                <w:rFonts w:ascii="Calibri" w:hAnsi="Calibri" w:eastAsia="宋体"/>
-                <w:sz w:val="20"/>
-              </w:rPr>
-              <w:t>github.com/Mabubakr86/PCP-Tracker-Project</w:t>
-            </w:r>
-          </w:p>
-        </w:tc>
-        <w:tc>
-          <w:tcPr>
-            <w:tcW w:type="dxa" w:w="2835"/>
-          </w:tcPr>
-          <w:p>
-            <w:r/>
-            <w:r>
-              <w:rPr>
-                <w:rFonts w:ascii="Calibri" w:hAnsi="Calibri" w:eastAsia="宋体"/>
-                <w:sz w:val="20"/>
-              </w:rPr>
-              <w:t>螺杆泵资产跟踪桌面应用</w:t>
-            </w:r>
-          </w:p>
-        </w:tc>
-        <w:tc>
-          <w:tcPr>
-            <w:tcW w:type="dxa" w:w="1361"/>
-          </w:tcPr>
-          <w:p>
-            <w:r/>
-            <w:r>
-              <w:rPr>
-                <w:rFonts w:ascii="Calibri" w:hAnsi="Calibri" w:eastAsia="宋体"/>
-                <w:sz w:val="20"/>
-              </w:rPr>
-              <w:t>否（资产管理）</w:t>
-            </w:r>
-          </w:p>
-        </w:tc>
-      </w:tr>
-      <w:tr>
-        <w:tc>
-          <w:tcPr>
-            <w:tcW w:type="dxa" w:w="2154"/>
-          </w:tcPr>
-          <w:p>
-            <w:r/>
-            <w:r>
-              <w:rPr>
-                <w:rFonts w:ascii="Calibri" w:hAnsi="Calibri" w:eastAsia="宋体"/>
-                <w:sz w:val="20"/>
-              </w:rPr>
-              <w:t>progressive-cavity-pump（OpenSCAD）</w:t>
-            </w:r>
-          </w:p>
-        </w:tc>
-        <w:tc>
-          <w:tcPr>
-            <w:tcW w:type="dxa" w:w="2721"/>
-          </w:tcPr>
-          <w:p>
-            <w:r/>
-            <w:r>
-              <w:rPr>
-                <w:rFonts w:ascii="Calibri" w:hAnsi="Calibri" w:eastAsia="宋体"/>
-                <w:sz w:val="20"/>
-              </w:rPr>
-              <w:t>github.com/Rmurthy1/progressive-cavity-pump</w:t>
-            </w:r>
-          </w:p>
-        </w:tc>
-        <w:tc>
-          <w:tcPr>
-            <w:tcW w:type="dxa" w:w="2835"/>
-          </w:tcPr>
-          <w:p>
-            <w:r/>
-            <w:r>
-              <w:rPr>
-                <w:rFonts w:ascii="Calibri" w:hAnsi="Calibri" w:eastAsia="宋体"/>
-                <w:sz w:val="20"/>
-              </w:rPr>
-              <w:t>泵三维几何建模</w:t>
-            </w:r>
-          </w:p>
-        </w:tc>
-        <w:tc>
-          <w:tcPr>
-            <w:tcW w:type="dxa" w:w="1361"/>
-          </w:tcPr>
-          <w:p>
-            <w:r/>
-            <w:r>
-              <w:rPr>
-                <w:rFonts w:ascii="Calibri" w:hAnsi="Calibri" w:eastAsia="宋体"/>
-                <w:sz w:val="20"/>
-              </w:rPr>
-              <w:t>否</w:t>
-            </w:r>
-          </w:p>
-        </w:tc>
-      </w:tr>
-      <w:tr>
-        <w:tc>
-          <w:tcPr>
-            <w:tcW w:type="dxa" w:w="2154"/>
-          </w:tcPr>
-          <w:p>
-            <w:r/>
-            <w:r>
-              <w:rPr>
-                <w:rFonts w:ascii="Calibri" w:hAnsi="Calibri" w:eastAsia="宋体"/>
-                <w:sz w:val="20"/>
-              </w:rPr>
-              <w:t>accapumps/progressive-cavity-pumps</w:t>
-            </w:r>
-          </w:p>
-        </w:tc>
-        <w:tc>
-          <w:tcPr>
-            <w:tcW w:type="dxa" w:w="2721"/>
-          </w:tcPr>
-          <w:p>
-            <w:r/>
-            <w:r>
-              <w:rPr>
-                <w:rFonts w:ascii="Calibri" w:hAnsi="Calibri" w:eastAsia="宋体"/>
-                <w:sz w:val="20"/>
-              </w:rPr>
-              <w:t>github.com/accapumps/progressive-cavity-pumps</w:t>
-            </w:r>
-          </w:p>
-        </w:tc>
-        <w:tc>
-          <w:tcPr>
-            <w:tcW w:type="dxa" w:w="2835"/>
-          </w:tcPr>
-          <w:p>
-            <w:r/>
-            <w:r>
-              <w:rPr>
-                <w:rFonts w:ascii="Calibri" w:hAnsi="Calibri" w:eastAsia="宋体"/>
-                <w:sz w:val="20"/>
-              </w:rPr>
-              <w:t>泵研究资料仓库</w:t>
-            </w:r>
-          </w:p>
-        </w:tc>
-        <w:tc>
-          <w:tcPr>
-            <w:tcW w:type="dxa" w:w="1361"/>
-          </w:tcPr>
-          <w:p>
-            <w:r/>
-            <w:r>
-              <w:rPr>
-                <w:rFonts w:ascii="Calibri" w:hAnsi="Calibri" w:eastAsia="宋体"/>
-                <w:sz w:val="20"/>
-              </w:rPr>
-              <w:t>否</w:t>
-            </w:r>
-          </w:p>
-        </w:tc>
-      </w:tr>
-    </w:tbl>
-    <w:p/>
-    <w:p>
-      <w:pPr>
-        <w:pStyle w:val="Heading2"/>
-      </w:pPr>
-      <w:r>
-        <w:rPr>
-          <w:rFonts w:ascii="Calibri" w:hAnsi="Calibri" w:eastAsia="黑体"/>
-          <w:b/>
-          <w:color w:val="1F4E79"/>
-          <w:sz w:val="26"/>
-        </w:rPr>
-        <w:t>1.2 最接近、可迁移的开源神经网络（需改特征后自训）</w:t>
-      </w:r>
-    </w:p>
-    <w:p>
-      <w:pPr>
-        <w:spacing w:after="120"/>
-        <w:ind w:firstLine="420"/>
-      </w:pPr>
-      <w:r>
-        <w:rPr>
-          <w:rFonts w:ascii="Calibri" w:hAnsi="Calibri" w:eastAsia="宋体"/>
-          <w:b/>
-          <w:sz w:val="21"/>
-        </w:rPr>
-        <w:t>以下项目是「通用虚拟计量 / 工况→产量」神经网络开源实现。它们不是螺杆泵专用，但代码完整，把输入从油嘴/井口压温改成转速、扭矩、电流、沉没度等泵参数，用本井试井产量做标签，即可做成螺杆泵井计产模型。这是目前落地的现实路径。</w:t>
+        <w:t>下表只列「能拿来改成螺杆泵井计产」的开源。与计产无关的（故障诊断、几何设计、资产管理）不列。</w:t>
       </w:r>
     </w:p>
     <w:tbl>
@@ -561,7 +118,7 @@
       <w:tr>
         <w:tc>
           <w:tcPr>
-            <w:tcW w:type="dxa" w:w="907"/>
+            <w:tcW w:type="dxa" w:w="1020"/>
           </w:tcPr>
           <w:p>
             <w:r/>
@@ -577,7 +134,7 @@
         </w:tc>
         <w:tc>
           <w:tcPr>
-            <w:tcW w:type="dxa" w:w="1587"/>
+            <w:tcW w:type="dxa" w:w="1701"/>
           </w:tcPr>
           <w:p>
             <w:r/>
@@ -593,7 +150,7 @@
         </w:tc>
         <w:tc>
           <w:tcPr>
-            <w:tcW w:type="dxa" w:w="2381"/>
+            <w:tcW w:type="dxa" w:w="2608"/>
           </w:tcPr>
           <w:p>
             <w:r/>
@@ -609,22 +166,6 @@
         </w:tc>
         <w:tc>
           <w:tcPr>
-            <w:tcW w:type="dxa" w:w="1928"/>
-          </w:tcPr>
-          <w:p>
-            <w:r/>
-            <w:r>
-              <w:rPr>
-                <w:rFonts w:ascii="Calibri" w:hAnsi="Calibri" w:eastAsia="黑体"/>
-                <w:b/>
-                <w:sz w:val="21"/>
-              </w:rPr>
-              <w:t>原任务</w:t>
-            </w:r>
-          </w:p>
-        </w:tc>
-        <w:tc>
-          <w:tcPr>
             <w:tcW w:type="dxa" w:w="2268"/>
           </w:tcPr>
           <w:p>
@@ -635,7 +176,23 @@
                 <w:b/>
                 <w:sz w:val="21"/>
               </w:rPr>
-              <w:t>如何改成螺杆泵井计产</w:t>
+              <w:t>原用途</w:t>
+            </w:r>
+          </w:p>
+        </w:tc>
+        <w:tc>
+          <w:tcPr>
+            <w:tcW w:type="dxa" w:w="1474"/>
+          </w:tcPr>
+          <w:p>
+            <w:r/>
+            <w:r>
+              <w:rPr>
+                <w:rFonts w:ascii="Calibri" w:hAnsi="Calibri" w:eastAsia="黑体"/>
+                <w:b/>
+                <w:sz w:val="21"/>
+              </w:rPr>
+              <w:t>迁移价值</w:t>
             </w:r>
           </w:p>
         </w:tc>
@@ -643,7 +200,7 @@
       <w:tr>
         <w:tc>
           <w:tcPr>
-            <w:tcW w:type="dxa" w:w="907"/>
+            <w:tcW w:type="dxa" w:w="1020"/>
           </w:tcPr>
           <w:p>
             <w:r/>
@@ -652,13 +209,13 @@
                 <w:rFonts w:ascii="Calibri" w:hAnsi="Calibri" w:eastAsia="宋体"/>
                 <w:sz w:val="20"/>
               </w:rPr>
-              <w:t>首选</w:t>
+              <w:t>1（首选）</w:t>
             </w:r>
           </w:p>
         </w:tc>
         <w:tc>
           <w:tcPr>
-            <w:tcW w:type="dxa" w:w="1587"/>
+            <w:tcW w:type="dxa" w:w="1701"/>
           </w:tcPr>
           <w:p>
             <w:r/>
@@ -673,7 +230,7 @@
         </w:tc>
         <w:tc>
           <w:tcPr>
-            <w:tcW w:type="dxa" w:w="2381"/>
+            <w:tcW w:type="dxa" w:w="2608"/>
           </w:tcPr>
           <w:p>
             <w:r/>
@@ -688,21 +245,6 @@
         </w:tc>
         <w:tc>
           <w:tcPr>
-            <w:tcW w:type="dxa" w:w="1928"/>
-          </w:tcPr>
-          <w:p>
-            <w:r/>
-            <w:r>
-              <w:rPr>
-                <w:rFonts w:ascii="Calibri" w:hAnsi="Calibri" w:eastAsia="宋体"/>
-                <w:sz w:val="20"/>
-              </w:rPr>
-              <w:t>Volve：井下/井口压温、油嘴 → 油气水产量</w:t>
-            </w:r>
-          </w:p>
-        </w:tc>
-        <w:tc>
-          <w:tcPr>
             <w:tcW w:type="dxa" w:w="2268"/>
           </w:tcPr>
           <w:p>
@@ -712,15 +254,13 @@
                 <w:rFonts w:ascii="Calibri" w:hAnsi="Calibri" w:eastAsia="宋体"/>
                 <w:sz w:val="20"/>
               </w:rPr>
-              <w:t>删油嘴特征；加入转速、扭矩/电流、沉没度；标签换成本井试井产量</w:t>
+              <w:t>Volve 油田：井口/井下压温、油嘴开度 → 油气水产量（Keras LSTM）</w:t>
             </w:r>
           </w:p>
         </w:tc>
-      </w:tr>
-      <w:tr>
         <w:tc>
           <w:tcPr>
-            <w:tcW w:type="dxa" w:w="907"/>
+            <w:tcW w:type="dxa" w:w="1474"/>
           </w:tcPr>
           <w:p>
             <w:r/>
@@ -729,13 +269,15 @@
                 <w:rFonts w:ascii="Calibri" w:hAnsi="Calibri" w:eastAsia="宋体"/>
                 <w:sz w:val="20"/>
               </w:rPr>
-              <w:t>推荐</w:t>
+              <w:t>管线最完整、最好改；把油嘴换成转速/扭矩即可</w:t>
             </w:r>
           </w:p>
         </w:tc>
+      </w:tr>
+      <w:tr>
         <w:tc>
           <w:tcPr>
-            <w:tcW w:type="dxa" w:w="1587"/>
+            <w:tcW w:type="dxa" w:w="1020"/>
           </w:tcPr>
           <w:p>
             <w:r/>
@@ -744,13 +286,28 @@
                 <w:rFonts w:ascii="Calibri" w:hAnsi="Calibri" w:eastAsia="宋体"/>
                 <w:sz w:val="20"/>
               </w:rPr>
-              <w:t>HVFM（TCN/MPFNet）</w:t>
+              <w:t>2</w:t>
             </w:r>
           </w:p>
         </w:tc>
         <w:tc>
           <w:tcPr>
-            <w:tcW w:type="dxa" w:w="2381"/>
+            <w:tcW w:type="dxa" w:w="1701"/>
+          </w:tcPr>
+          <w:p>
+            <w:r/>
+            <w:r>
+              <w:rPr>
+                <w:rFonts w:ascii="Calibri" w:hAnsi="Calibri" w:eastAsia="宋体"/>
+                <w:sz w:val="20"/>
+              </w:rPr>
+              <w:t>HVFM</w:t>
+            </w:r>
+          </w:p>
+        </w:tc>
+        <w:tc>
+          <w:tcPr>
+            <w:tcW w:type="dxa" w:w="2608"/>
           </w:tcPr>
           <w:p>
             <w:r/>
@@ -767,7 +324,7 @@
         </w:tc>
         <w:tc>
           <w:tcPr>
-            <w:tcW w:type="dxa" w:w="1928"/>
+            <w:tcW w:type="dxa" w:w="2268"/>
           </w:tcPr>
           <w:p>
             <w:r/>
@@ -776,7 +333,69 @@
                 <w:rFonts w:ascii="Calibri" w:hAnsi="Calibri" w:eastAsia="宋体"/>
                 <w:sz w:val="20"/>
               </w:rPr>
-              <w:t>机理+数据双驱动瞬态多相 VFM</w:t>
+              <w:t>机理+数据双驱动多相虚拟计量（TCN）</w:t>
+            </w:r>
+          </w:p>
+        </w:tc>
+        <w:tc>
+          <w:tcPr>
+            <w:tcW w:type="dxa" w:w="1474"/>
+          </w:tcPr>
+          <w:p>
+            <w:r/>
+            <w:r>
+              <w:rPr>
+                <w:rFonts w:ascii="Calibri" w:hAnsi="Calibri" w:eastAsia="宋体"/>
+                <w:sz w:val="20"/>
+              </w:rPr>
+              <w:t>网络更强；机理部分可换成泵「理论排量−滑脱」</w:t>
+            </w:r>
+          </w:p>
+        </w:tc>
+      </w:tr>
+      <w:tr>
+        <w:tc>
+          <w:tcPr>
+            <w:tcW w:type="dxa" w:w="1020"/>
+          </w:tcPr>
+          <w:p>
+            <w:r/>
+            <w:r>
+              <w:rPr>
+                <w:rFonts w:ascii="Calibri" w:hAnsi="Calibri" w:eastAsia="宋体"/>
+                <w:sz w:val="20"/>
+              </w:rPr>
+              <w:t>3</w:t>
+            </w:r>
+          </w:p>
+        </w:tc>
+        <w:tc>
+          <w:tcPr>
+            <w:tcW w:type="dxa" w:w="1701"/>
+          </w:tcPr>
+          <w:p>
+            <w:r/>
+            <w:r>
+              <w:rPr>
+                <w:rFonts w:ascii="Calibri" w:hAnsi="Calibri" w:eastAsia="宋体"/>
+                <w:sz w:val="20"/>
+              </w:rPr>
+              <w:t>Andrianov VFM</w:t>
+            </w:r>
+          </w:p>
+        </w:tc>
+        <w:tc>
+          <w:tcPr>
+            <w:tcW w:type="dxa" w:w="2608"/>
+          </w:tcPr>
+          <w:p>
+            <w:r/>
+            <w:r>
+              <w:rPr>
+                <w:rFonts w:ascii="Calibri" w:hAnsi="Calibri" w:eastAsia="宋体"/>
+                <w:sz w:val="20"/>
+              </w:rPr>
+              <w:t>github.com/nikolai-andrianov/VFM</w:t>
             </w:r>
           </w:p>
         </w:tc>
@@ -791,15 +410,13 @@
                 <w:rFonts w:ascii="Calibri" w:hAnsi="Calibri" w:eastAsia="宋体"/>
                 <w:sz w:val="20"/>
               </w:rPr>
-              <w:t>保留 TCN 结构；机理部分换成「理论排量−滑脱」泵公式</w:t>
+              <w:t>IFAC 论文配套：神经网络估产 + 数据集</w:t>
             </w:r>
           </w:p>
         </w:tc>
-      </w:tr>
-      <w:tr>
         <w:tc>
           <w:tcPr>
-            <w:tcW w:type="dxa" w:w="907"/>
+            <w:tcW w:type="dxa" w:w="1474"/>
           </w:tcPr>
           <w:p>
             <w:r/>
@@ -808,7 +425,442 @@
                 <w:rFonts w:ascii="Calibri" w:hAnsi="Calibri" w:eastAsia="宋体"/>
                 <w:sz w:val="20"/>
               </w:rPr>
-              <w:t>推荐</w:t>
+              <w:t>论文级可复现训练流程</w:t>
+            </w:r>
+          </w:p>
+        </w:tc>
+      </w:tr>
+      <w:tr>
+        <w:tc>
+          <w:tcPr>
+            <w:tcW w:type="dxa" w:w="1020"/>
+          </w:tcPr>
+          <w:p>
+            <w:r/>
+            <w:r>
+              <w:rPr>
+                <w:rFonts w:ascii="Calibri" w:hAnsi="Calibri" w:eastAsia="宋体"/>
+                <w:sz w:val="20"/>
+              </w:rPr>
+              <w:t>4</w:t>
+            </w:r>
+          </w:p>
+        </w:tc>
+        <w:tc>
+          <w:tcPr>
+            <w:tcW w:type="dxa" w:w="1701"/>
+          </w:tcPr>
+          <w:p>
+            <w:r/>
+            <w:r>
+              <w:rPr>
+                <w:rFonts w:ascii="Calibri" w:hAnsi="Calibri" w:eastAsia="宋体"/>
+                <w:sz w:val="20"/>
+              </w:rPr>
+              <w:t>ManyWells ML 示例</w:t>
+            </w:r>
+          </w:p>
+        </w:tc>
+        <w:tc>
+          <w:tcPr>
+            <w:tcW w:type="dxa" w:w="2608"/>
+          </w:tcPr>
+          <w:p>
+            <w:r/>
+            <w:r>
+              <w:rPr>
+                <w:rFonts w:ascii="Calibri" w:hAnsi="Calibri" w:eastAsia="宋体"/>
+                <w:sz w:val="20"/>
+              </w:rPr>
+              <w:t>github.com/solution-seeker-as/manywells</w:t>
+              <w:br/>
+              <w:t>（scripts/ml_examples）</w:t>
+            </w:r>
+          </w:p>
+        </w:tc>
+        <w:tc>
+          <w:tcPr>
+            <w:tcW w:type="dxa" w:w="2268"/>
+          </w:tcPr>
+          <w:p>
+            <w:r/>
+            <w:r>
+              <w:rPr>
+                <w:rFonts w:ascii="Calibri" w:hAnsi="Calibri" w:eastAsia="宋体"/>
+                <w:sz w:val="20"/>
+              </w:rPr>
+              <w:t>NTNU 官方神经网络 VFM 基准</w:t>
+            </w:r>
+          </w:p>
+        </w:tc>
+        <w:tc>
+          <w:tcPr>
+            <w:tcW w:type="dxa" w:w="1474"/>
+          </w:tcPr>
+          <w:p>
+            <w:r/>
+            <w:r>
+              <w:rPr>
+                <w:rFonts w:ascii="Calibri" w:hAnsi="Calibri" w:eastAsia="宋体"/>
+                <w:sz w:val="20"/>
+              </w:rPr>
+              <w:t>对比不同网络结构时用</w:t>
+            </w:r>
+          </w:p>
+        </w:tc>
+      </w:tr>
+      <w:tr>
+        <w:tc>
+          <w:tcPr>
+            <w:tcW w:type="dxa" w:w="1020"/>
+          </w:tcPr>
+          <w:p>
+            <w:r/>
+            <w:r>
+              <w:rPr>
+                <w:rFonts w:ascii="Calibri" w:hAnsi="Calibri" w:eastAsia="宋体"/>
+                <w:sz w:val="20"/>
+              </w:rPr>
+              <w:t>5</w:t>
+            </w:r>
+          </w:p>
+        </w:tc>
+        <w:tc>
+          <w:tcPr>
+            <w:tcW w:type="dxa" w:w="1701"/>
+          </w:tcPr>
+          <w:p>
+            <w:r/>
+            <w:r>
+              <w:rPr>
+                <w:rFonts w:ascii="Calibri" w:hAnsi="Calibri" w:eastAsia="宋体"/>
+                <w:sz w:val="20"/>
+              </w:rPr>
+              <w:t>pi-vfm</w:t>
+            </w:r>
+          </w:p>
+        </w:tc>
+        <w:tc>
+          <w:tcPr>
+            <w:tcW w:type="dxa" w:w="2608"/>
+          </w:tcPr>
+          <w:p>
+            <w:r/>
+            <w:r>
+              <w:rPr>
+                <w:rFonts w:ascii="Calibri" w:hAnsi="Calibri" w:eastAsia="宋体"/>
+                <w:sz w:val="20"/>
+              </w:rPr>
+              <w:t>github.com/CryptoGuy1/pi-vfm</w:t>
+            </w:r>
+          </w:p>
+        </w:tc>
+        <w:tc>
+          <w:tcPr>
+            <w:tcW w:type="dxa" w:w="2268"/>
+          </w:tcPr>
+          <w:p>
+            <w:r/>
+            <w:r>
+              <w:rPr>
+                <w:rFonts w:ascii="Calibri" w:hAnsi="Calibri" w:eastAsia="宋体"/>
+                <w:sz w:val="20"/>
+              </w:rPr>
+              <w:t>物理信息神经网络（PINN）虚拟计量</w:t>
+            </w:r>
+          </w:p>
+        </w:tc>
+        <w:tc>
+          <w:tcPr>
+            <w:tcW w:type="dxa" w:w="1474"/>
+          </w:tcPr>
+          <w:p>
+            <w:r/>
+            <w:r>
+              <w:rPr>
+                <w:rFonts w:ascii="Calibri" w:hAnsi="Calibri" w:eastAsia="宋体"/>
+                <w:sz w:val="20"/>
+              </w:rPr>
+              <w:t>可把泵排量公式写入损失函数</w:t>
+            </w:r>
+          </w:p>
+        </w:tc>
+      </w:tr>
+      <w:tr>
+        <w:tc>
+          <w:tcPr>
+            <w:tcW w:type="dxa" w:w="1020"/>
+          </w:tcPr>
+          <w:p>
+            <w:r/>
+            <w:r>
+              <w:rPr>
+                <w:rFonts w:ascii="Calibri" w:hAnsi="Calibri" w:eastAsia="宋体"/>
+                <w:sz w:val="20"/>
+              </w:rPr>
+              <w:t>6</w:t>
+            </w:r>
+          </w:p>
+        </w:tc>
+        <w:tc>
+          <w:tcPr>
+            <w:tcW w:type="dxa" w:w="1701"/>
+          </w:tcPr>
+          <w:p>
+            <w:r/>
+            <w:r>
+              <w:rPr>
+                <w:rFonts w:ascii="Calibri" w:hAnsi="Calibri" w:eastAsia="宋体"/>
+                <w:sz w:val="20"/>
+              </w:rPr>
+              <w:t>ESP Digital Twin</w:t>
+            </w:r>
+          </w:p>
+        </w:tc>
+        <w:tc>
+          <w:tcPr>
+            <w:tcW w:type="dxa" w:w="2608"/>
+          </w:tcPr>
+          <w:p>
+            <w:r/>
+            <w:r>
+              <w:rPr>
+                <w:rFonts w:ascii="Calibri" w:hAnsi="Calibri" w:eastAsia="宋体"/>
+                <w:sz w:val="20"/>
+              </w:rPr>
+              <w:t>github.com/abhi133113/Artificial-lift-ESP-Autonomous</w:t>
+            </w:r>
+          </w:p>
+        </w:tc>
+        <w:tc>
+          <w:tcPr>
+            <w:tcW w:type="dxa" w:w="2268"/>
+          </w:tcPr>
+          <w:p>
+            <w:r/>
+            <w:r>
+              <w:rPr>
+                <w:rFonts w:ascii="Calibri" w:hAnsi="Calibri" w:eastAsia="宋体"/>
+                <w:sz w:val="20"/>
+              </w:rPr>
+              <w:t>电潜泵：LSTM + 泵曲线物理校验</w:t>
+            </w:r>
+          </w:p>
+        </w:tc>
+        <w:tc>
+          <w:tcPr>
+            <w:tcW w:type="dxa" w:w="1474"/>
+          </w:tcPr>
+          <w:p>
+            <w:r/>
+            <w:r>
+              <w:rPr>
+                <w:rFonts w:ascii="Calibri" w:hAnsi="Calibri" w:eastAsia="宋体"/>
+                <w:sz w:val="20"/>
+              </w:rPr>
+              <w:t>同为人工举升，输入最像（频率/功率/压力）；需改成「当前产量」回归</w:t>
+            </w:r>
+          </w:p>
+        </w:tc>
+      </w:tr>
+    </w:tbl>
+    <w:p/>
+    <w:p>
+      <w:pPr>
+        <w:spacing w:after="120"/>
+        <w:ind w:firstLine="420"/>
+      </w:pPr>
+      <w:r>
+        <w:rPr>
+          <w:rFonts w:ascii="Calibri" w:hAnsi="Calibri" w:eastAsia="宋体"/>
+          <w:b w:val="0"/>
+          <w:sz w:val="21"/>
+        </w:rPr>
+        <w:t>说明：电潜泵（ESP）与螺杆泵（PCP）都是人工举升，传感器形态接近（转速/频率、电流/功率、压力），所以第 6 项虽然不是计产成品，迁移思路最接近。第 1–5 项是通用「工况→产量」计产网络，改特征后就是螺杆泵井计产模型。</w:t>
+      </w:r>
+    </w:p>
+    <w:p>
+      <w:pPr>
+        <w:pStyle w:val="Heading1"/>
+      </w:pPr>
+      <w:r>
+        <w:rPr>
+          <w:rFonts w:ascii="Calibri" w:hAnsi="Calibri" w:eastAsia="黑体"/>
+          <w:b/>
+          <w:color w:val="1F4E79"/>
+          <w:sz w:val="32"/>
+        </w:rPr>
+        <w:t>三、怎么迁移（按步骤做）</w:t>
+      </w:r>
+    </w:p>
+    <w:p>
+      <w:pPr>
+        <w:pStyle w:val="Heading2"/>
+      </w:pPr>
+      <w:r>
+        <w:rPr>
+          <w:rFonts w:ascii="Calibri" w:hAnsi="Calibri" w:eastAsia="黑体"/>
+          <w:b/>
+          <w:color w:val="1F4E79"/>
+          <w:sz w:val="26"/>
+        </w:rPr>
+        <w:t>3.1 迁移对照：原模型 → 螺杆泵井</w:t>
+      </w:r>
+    </w:p>
+    <w:tbl>
+      <w:tblPr>
+        <w:tblStyle w:val="LightGrid-Accent1"/>
+        <w:tblW w:type="auto" w:w="0"/>
+        <w:jc w:val="center"/>
+        <w:tblLook w:firstColumn="1" w:firstRow="1" w:lastColumn="0" w:lastRow="0" w:noHBand="0" w:noVBand="1" w:val="04A0"/>
+      </w:tblPr>
+      <w:tblGrid>
+        <w:gridCol w:w="1729"/>
+        <w:gridCol w:w="1729"/>
+        <w:gridCol w:w="1729"/>
+        <w:gridCol w:w="1729"/>
+        <w:gridCol w:w="1729"/>
+      </w:tblGrid>
+      <w:tr>
+        <w:tc>
+          <w:tcPr>
+            <w:tcW w:type="dxa" w:w="1701"/>
+          </w:tcPr>
+          <w:p>
+            <w:r/>
+            <w:r>
+              <w:rPr>
+                <w:rFonts w:ascii="Calibri" w:hAnsi="Calibri" w:eastAsia="黑体"/>
+                <w:b/>
+                <w:sz w:val="21"/>
+              </w:rPr>
+              <w:t>项目</w:t>
+            </w:r>
+          </w:p>
+        </w:tc>
+        <w:tc>
+          <w:tcPr>
+            <w:tcW w:type="dxa" w:w="2041"/>
+          </w:tcPr>
+          <w:p>
+            <w:r/>
+            <w:r>
+              <w:rPr>
+                <w:rFonts w:ascii="Calibri" w:hAnsi="Calibri" w:eastAsia="黑体"/>
+                <w:b/>
+                <w:sz w:val="21"/>
+              </w:rPr>
+              <w:t>原输入（删掉或替换）</w:t>
+            </w:r>
+          </w:p>
+        </w:tc>
+        <w:tc>
+          <w:tcPr>
+            <w:tcW w:type="dxa" w:w="2381"/>
+          </w:tcPr>
+          <w:p>
+            <w:r/>
+            <w:r>
+              <w:rPr>
+                <w:rFonts w:ascii="Calibri" w:hAnsi="Calibri" w:eastAsia="黑体"/>
+                <w:b/>
+                <w:sz w:val="21"/>
+              </w:rPr>
+              <w:t>换成螺杆泵井输入</w:t>
+            </w:r>
+          </w:p>
+        </w:tc>
+        <w:tc>
+          <w:tcPr>
+            <w:tcW w:type="dxa" w:w="1361"/>
+          </w:tcPr>
+          <w:p>
+            <w:r/>
+            <w:r>
+              <w:rPr>
+                <w:rFonts w:ascii="Calibri" w:hAnsi="Calibri" w:eastAsia="黑体"/>
+                <w:b/>
+                <w:sz w:val="21"/>
+              </w:rPr>
+              <w:t>原输出</w:t>
+            </w:r>
+          </w:p>
+        </w:tc>
+        <w:tc>
+          <w:tcPr>
+            <w:tcW w:type="dxa" w:w="1587"/>
+          </w:tcPr>
+          <w:p>
+            <w:r/>
+            <w:r>
+              <w:rPr>
+                <w:rFonts w:ascii="Calibri" w:hAnsi="Calibri" w:eastAsia="黑体"/>
+                <w:b/>
+                <w:sz w:val="21"/>
+              </w:rPr>
+              <w:t>换成</w:t>
+            </w:r>
+          </w:p>
+        </w:tc>
+      </w:tr>
+      <w:tr>
+        <w:tc>
+          <w:tcPr>
+            <w:tcW w:type="dxa" w:w="1701"/>
+          </w:tcPr>
+          <w:p>
+            <w:r/>
+            <w:r>
+              <w:rPr>
+                <w:rFonts w:ascii="Calibri" w:hAnsi="Calibri" w:eastAsia="宋体"/>
+                <w:sz w:val="20"/>
+              </w:rPr>
+              <w:t>LSTM-for-Production 等</w:t>
+            </w:r>
+          </w:p>
+        </w:tc>
+        <w:tc>
+          <w:tcPr>
+            <w:tcW w:type="dxa" w:w="2041"/>
+          </w:tcPr>
+          <w:p>
+            <w:r/>
+            <w:r>
+              <w:rPr>
+                <w:rFonts w:ascii="Calibri" w:hAnsi="Calibri" w:eastAsia="宋体"/>
+                <w:sz w:val="20"/>
+              </w:rPr>
+              <w:t>油嘴开度、井下压温、环空压力…</w:t>
+            </w:r>
+          </w:p>
+        </w:tc>
+        <w:tc>
+          <w:tcPr>
+            <w:tcW w:type="dxa" w:w="2381"/>
+          </w:tcPr>
+          <w:p>
+            <w:r/>
+            <w:r>
+              <w:rPr>
+                <w:rFonts w:ascii="Calibri" w:hAnsi="Calibri" w:eastAsia="宋体"/>
+                <w:sz w:val="20"/>
+              </w:rPr>
+              <w:t>转速、扭矩或电流、井口油压、回压、沉没度/吸入口压力、井口温度、含水</w:t>
+            </w:r>
+          </w:p>
+        </w:tc>
+        <w:tc>
+          <w:tcPr>
+            <w:tcW w:type="dxa" w:w="1361"/>
+          </w:tcPr>
+          <w:p>
+            <w:r/>
+            <w:r>
+              <w:rPr>
+                <w:rFonts w:ascii="Calibri" w:hAnsi="Calibri" w:eastAsia="宋体"/>
+                <w:sz w:val="20"/>
+              </w:rPr>
+              <w:t>油气水日产量</w:t>
             </w:r>
           </w:p>
         </w:tc>
@@ -823,7 +875,39 @@
                 <w:rFonts w:ascii="Calibri" w:hAnsi="Calibri" w:eastAsia="宋体"/>
                 <w:sz w:val="20"/>
               </w:rPr>
-              <w:t>VFM (Andrianov)</w:t>
+              <w:t>本井试井油/液产量（或翻斗计量）</w:t>
+            </w:r>
+          </w:p>
+        </w:tc>
+      </w:tr>
+      <w:tr>
+        <w:tc>
+          <w:tcPr>
+            <w:tcW w:type="dxa" w:w="1701"/>
+          </w:tcPr>
+          <w:p>
+            <w:r/>
+            <w:r>
+              <w:rPr>
+                <w:rFonts w:ascii="Calibri" w:hAnsi="Calibri" w:eastAsia="宋体"/>
+                <w:sz w:val="20"/>
+              </w:rPr>
+              <w:t>ESP Digital Twin</w:t>
+            </w:r>
+          </w:p>
+        </w:tc>
+        <w:tc>
+          <w:tcPr>
+            <w:tcW w:type="dxa" w:w="2041"/>
+          </w:tcPr>
+          <w:p>
+            <w:r/>
+            <w:r>
+              <w:rPr>
+                <w:rFonts w:ascii="Calibri" w:hAnsi="Calibri" w:eastAsia="宋体"/>
+                <w:sz w:val="20"/>
+              </w:rPr>
+              <w:t>频率、有功功率、PIP 等</w:t>
             </w:r>
           </w:p>
         </w:tc>
@@ -838,13 +922,13 @@
                 <w:rFonts w:ascii="Calibri" w:hAnsi="Calibri" w:eastAsia="宋体"/>
                 <w:sz w:val="20"/>
               </w:rPr>
-              <w:t>github.com/nikolai-andrianov/VFM</w:t>
+              <w:t>几乎可直接对应：频率→转速，功率→电流/扭矩，压力保留</w:t>
             </w:r>
           </w:p>
         </w:tc>
         <w:tc>
           <w:tcPr>
-            <w:tcW w:type="dxa" w:w="1928"/>
+            <w:tcW w:type="dxa" w:w="1361"/>
           </w:tcPr>
           <w:p>
             <w:r/>
@@ -853,39 +937,7 @@
                 <w:rFonts w:ascii="Calibri" w:hAnsi="Calibri" w:eastAsia="宋体"/>
                 <w:sz w:val="20"/>
               </w:rPr>
-              <w:t>IFAC 论文配套 NN 估产 + 数据集</w:t>
-            </w:r>
-          </w:p>
-        </w:tc>
-        <w:tc>
-          <w:tcPr>
-            <w:tcW w:type="dxa" w:w="2268"/>
-          </w:tcPr>
-          <w:p>
-            <w:r/>
-            <w:r>
-              <w:rPr>
-                <w:rFonts w:ascii="Calibri" w:hAnsi="Calibri" w:eastAsia="宋体"/>
-                <w:sz w:val="20"/>
-              </w:rPr>
-              <w:t>沿用训练管线；特征与标签换为泵工况与试井产量</w:t>
-            </w:r>
-          </w:p>
-        </w:tc>
-      </w:tr>
-      <w:tr>
-        <w:tc>
-          <w:tcPr>
-            <w:tcW w:type="dxa" w:w="907"/>
-          </w:tcPr>
-          <w:p>
-            <w:r/>
-            <w:r>
-              <w:rPr>
-                <w:rFonts w:ascii="Calibri" w:hAnsi="Calibri" w:eastAsia="宋体"/>
-                <w:sz w:val="20"/>
-              </w:rPr>
-              <w:t>参考</w:t>
+              <w:t>未来趋势/异常</w:t>
             </w:r>
           </w:p>
         </w:tc>
@@ -900,208 +952,7 @@
                 <w:rFonts w:ascii="Calibri" w:hAnsi="Calibri" w:eastAsia="宋体"/>
                 <w:sz w:val="20"/>
               </w:rPr>
-              <w:t>ManyWells ml_examples</w:t>
-            </w:r>
-          </w:p>
-        </w:tc>
-        <w:tc>
-          <w:tcPr>
-            <w:tcW w:type="dxa" w:w="2381"/>
-          </w:tcPr>
-          <w:p>
-            <w:r/>
-            <w:r>
-              <w:rPr>
-                <w:rFonts w:ascii="Calibri" w:hAnsi="Calibri" w:eastAsia="宋体"/>
-                <w:sz w:val="20"/>
-              </w:rPr>
-              <w:t>github.com/solution-seeker-as/manywells</w:t>
-            </w:r>
-          </w:p>
-        </w:tc>
-        <w:tc>
-          <w:tcPr>
-            <w:tcW w:type="dxa" w:w="1928"/>
-          </w:tcPr>
-          <w:p>
-            <w:r/>
-            <w:r>
-              <w:rPr>
-                <w:rFonts w:ascii="Calibri" w:hAnsi="Calibri" w:eastAsia="宋体"/>
-                <w:sz w:val="20"/>
-              </w:rPr>
-              <w:t>NTNU 官方 NN VFM 基准示例</w:t>
-            </w:r>
-          </w:p>
-        </w:tc>
-        <w:tc>
-          <w:tcPr>
-            <w:tcW w:type="dxa" w:w="2268"/>
-          </w:tcPr>
-          <w:p>
-            <w:r/>
-            <w:r>
-              <w:rPr>
-                <w:rFonts w:ascii="Calibri" w:hAnsi="Calibri" w:eastAsia="宋体"/>
-                <w:sz w:val="20"/>
-              </w:rPr>
-              <w:t>练网络对比方法；数据为仿真井筒，无泵</w:t>
-            </w:r>
-          </w:p>
-        </w:tc>
-      </w:tr>
-      <w:tr>
-        <w:tc>
-          <w:tcPr>
-            <w:tcW w:type="dxa" w:w="907"/>
-          </w:tcPr>
-          <w:p>
-            <w:r/>
-            <w:r>
-              <w:rPr>
-                <w:rFonts w:ascii="Calibri" w:hAnsi="Calibri" w:eastAsia="宋体"/>
-                <w:sz w:val="20"/>
-              </w:rPr>
-              <w:t>参考</w:t>
-            </w:r>
-          </w:p>
-        </w:tc>
-        <w:tc>
-          <w:tcPr>
-            <w:tcW w:type="dxa" w:w="1587"/>
-          </w:tcPr>
-          <w:p>
-            <w:r/>
-            <w:r>
-              <w:rPr>
-                <w:rFonts w:ascii="Calibri" w:hAnsi="Calibri" w:eastAsia="宋体"/>
-                <w:sz w:val="20"/>
-              </w:rPr>
-              <w:t>pi-vfm / Hybrid_VFM_Slugging</w:t>
-            </w:r>
-          </w:p>
-        </w:tc>
-        <w:tc>
-          <w:tcPr>
-            <w:tcW w:type="dxa" w:w="2381"/>
-          </w:tcPr>
-          <w:p>
-            <w:r/>
-            <w:r>
-              <w:rPr>
-                <w:rFonts w:ascii="Calibri" w:hAnsi="Calibri" w:eastAsia="宋体"/>
-                <w:sz w:val="20"/>
-              </w:rPr>
-              <w:t>CryptoGuy1/pi-vfm</w:t>
-              <w:br/>
-              <w:t>caioazevedo-mdm/Hybrid_VFM_Slugging</w:t>
-            </w:r>
-          </w:p>
-        </w:tc>
-        <w:tc>
-          <w:tcPr>
-            <w:tcW w:type="dxa" w:w="1928"/>
-          </w:tcPr>
-          <w:p>
-            <w:r/>
-            <w:r>
-              <w:rPr>
-                <w:rFonts w:ascii="Calibri" w:hAnsi="Calibri" w:eastAsia="宋体"/>
-                <w:sz w:val="20"/>
-              </w:rPr>
-              <w:t>PINN / 扩散增广 VFM</w:t>
-            </w:r>
-          </w:p>
-        </w:tc>
-        <w:tc>
-          <w:tcPr>
-            <w:tcW w:type="dxa" w:w="2268"/>
-          </w:tcPr>
-          <w:p>
-            <w:r/>
-            <w:r>
-              <w:rPr>
-                <w:rFonts w:ascii="Calibri" w:hAnsi="Calibri" w:eastAsia="宋体"/>
-                <w:sz w:val="20"/>
-              </w:rPr>
-              <w:t>可把泵排量守恒写入物理损失</w:t>
-            </w:r>
-          </w:p>
-        </w:tc>
-      </w:tr>
-      <w:tr>
-        <w:tc>
-          <w:tcPr>
-            <w:tcW w:type="dxa" w:w="907"/>
-          </w:tcPr>
-          <w:p>
-            <w:r/>
-            <w:r>
-              <w:rPr>
-                <w:rFonts w:ascii="Calibri" w:hAnsi="Calibri" w:eastAsia="宋体"/>
-                <w:sz w:val="20"/>
-              </w:rPr>
-              <w:t>近邻（ESP）</w:t>
-            </w:r>
-          </w:p>
-        </w:tc>
-        <w:tc>
-          <w:tcPr>
-            <w:tcW w:type="dxa" w:w="1587"/>
-          </w:tcPr>
-          <w:p>
-            <w:r/>
-            <w:r>
-              <w:rPr>
-                <w:rFonts w:ascii="Calibri" w:hAnsi="Calibri" w:eastAsia="宋体"/>
-                <w:sz w:val="20"/>
-              </w:rPr>
-              <w:t>ESP Digital Twin</w:t>
-            </w:r>
-          </w:p>
-        </w:tc>
-        <w:tc>
-          <w:tcPr>
-            <w:tcW w:type="dxa" w:w="2381"/>
-          </w:tcPr>
-          <w:p>
-            <w:r/>
-            <w:r>
-              <w:rPr>
-                <w:rFonts w:ascii="Calibri" w:hAnsi="Calibri" w:eastAsia="宋体"/>
-                <w:sz w:val="20"/>
-              </w:rPr>
-              <w:t>github.com/abhi133113/Artificial-lift-ESP-Autonomous</w:t>
-            </w:r>
-          </w:p>
-        </w:tc>
-        <w:tc>
-          <w:tcPr>
-            <w:tcW w:type="dxa" w:w="1928"/>
-          </w:tcPr>
-          <w:p>
-            <w:r/>
-            <w:r>
-              <w:rPr>
-                <w:rFonts w:ascii="Calibri" w:hAnsi="Calibri" w:eastAsia="宋体"/>
-                <w:sz w:val="20"/>
-              </w:rPr>
-              <w:t>电潜泵：LSTM 预测 + 异常检测 + 泵曲线物理校验</w:t>
-            </w:r>
-          </w:p>
-        </w:tc>
-        <w:tc>
-          <w:tcPr>
-            <w:tcW w:type="dxa" w:w="2268"/>
-          </w:tcPr>
-          <w:p>
-            <w:r/>
-            <w:r>
-              <w:rPr>
-                <w:rFonts w:ascii="Calibri" w:hAnsi="Calibri" w:eastAsia="宋体"/>
-                <w:sz w:val="20"/>
-              </w:rPr>
-              <w:t>人工举升 NN 最接近；任务偏预测/故障，需改成「当前产量」回归</w:t>
+              <w:t>改成当前时刻产量回归（换损失与标签）</w:t>
             </w:r>
           </w:p>
         </w:tc>
@@ -1119,108 +970,7 @@
           <w:color w:val="1F4E79"/>
           <w:sz w:val="26"/>
         </w:rPr>
-        <w:t>1.3 为什么几乎没有开源螺杆泵计产 NN</w:t>
-      </w:r>
-    </w:p>
-    <w:p>
-      <w:pPr>
-        <w:pStyle w:val="ListBullet"/>
-        <w:spacing w:after="80"/>
-      </w:pPr>
-      <w:r>
-        <w:rPr>
-          <w:rFonts w:ascii="Calibri" w:hAnsi="Calibri" w:eastAsia="宋体"/>
-          <w:sz w:val="21"/>
-        </w:rPr>
-        <w:t>计产模型必须用本井试井/流量计数据训练，公开预训练权重没有通用价值；</w:t>
-      </w:r>
-    </w:p>
-    <w:p>
-      <w:pPr>
-        <w:pStyle w:val="ListBullet"/>
-        <w:spacing w:after="80"/>
-      </w:pPr>
-      <w:r>
-        <w:rPr>
-          <w:rFonts w:ascii="Calibri" w:hAnsi="Calibri" w:eastAsia="宋体"/>
-          <w:sz w:val="21"/>
-        </w:rPr>
-        <w:t>螺杆泵井运行数据多为油田内部数据，几乎不公开；</w:t>
-      </w:r>
-    </w:p>
-    <w:p>
-      <w:pPr>
-        <w:pStyle w:val="ListBullet"/>
-        <w:spacing w:after="80"/>
-      </w:pPr>
-      <w:r>
-        <w:rPr>
-          <w:rFonts w:ascii="Calibri" w:hAnsi="Calibri" w:eastAsia="宋体"/>
-          <w:sz w:val="21"/>
-        </w:rPr>
-        <w:t>工业虚拟计量产品（含人工举升）全部闭源；</w:t>
-      </w:r>
-    </w:p>
-    <w:p>
-      <w:pPr>
-        <w:pStyle w:val="ListBullet"/>
-        <w:spacing w:after="80"/>
-      </w:pPr>
-      <w:r>
-        <w:rPr>
-          <w:rFonts w:ascii="Calibri" w:hAnsi="Calibri" w:eastAsia="宋体"/>
-          <w:sz w:val="21"/>
-        </w:rPr>
-        <w:t>学术上螺杆泵相关公开工作更多是特性曲线解析模型、CFD、故障诊断，而非开源计产 NN。</w:t>
-      </w:r>
-    </w:p>
-    <w:p>
-      <w:pPr>
-        <w:pStyle w:val="Heading1"/>
-      </w:pPr>
-      <w:r>
-        <w:rPr>
-          <w:rFonts w:ascii="Calibri" w:hAnsi="Calibri" w:eastAsia="黑体"/>
-          <w:b/>
-          <w:color w:val="1F4E79"/>
-          <w:sz w:val="32"/>
-        </w:rPr>
-        <w:t>二、螺杆泵井计产定义与机理计产流程</w:t>
-      </w:r>
-    </w:p>
-    <w:p>
-      <w:pPr>
-        <w:spacing w:after="160"/>
-      </w:pPr>
-      <w:r>
-        <w:rPr>
-          <w:rFonts w:ascii="Calibri" w:hAnsi="Calibri" w:eastAsia="黑体"/>
-          <w:b/>
-          <w:color w:val="1F4E79"/>
-          <w:sz w:val="21"/>
-        </w:rPr>
-        <w:t>【本章概述】</w:t>
-      </w:r>
-      <w:r>
-        <w:rPr>
-          <w:rFonts w:ascii="Calibri" w:hAnsi="Calibri" w:eastAsia="宋体"/>
-          <w:sz w:val="21"/>
-        </w:rPr>
-        <w:t>在动手改开源 NN 之前，必须先弄清「计产」在螺杆泵井上意味着什么，以及机理法如何用三个辅助模型算出产量。神经网络计产是在学同一条映射。</w:t>
-      </w:r>
-    </w:p>
-    <w:p>
-      <w:pPr>
-        <w:pStyle w:val="Heading2"/>
-      </w:pPr>
-      <w:r>
-        <w:rPr>
-          <w:rFonts w:ascii="Calibri" w:hAnsi="Calibri" w:eastAsia="黑体"/>
-          <w:b/>
-          <w:color w:val="1F4E79"/>
-          <w:sz w:val="26"/>
-        </w:rPr>
-        <w:t>2.1 计产 vs 产量预测（不要搞混）</w:t>
+        <w:t>3.2 推荐特征（螺杆泵井）</w:t>
       </w:r>
     </w:p>
     <w:tbl>
@@ -1248,1236 +998,13 @@
                 <w:b/>
                 <w:sz w:val="21"/>
               </w:rPr>
+              <w:t>是否必需</w:t>
             </w:r>
           </w:p>
         </w:tc>
         <w:tc>
           <w:tcPr>
-            <w:tcW w:type="dxa" w:w="3855"/>
-          </w:tcPr>
-          <w:p>
-            <w:r/>
-            <w:r>
-              <w:rPr>
-                <w:rFonts w:ascii="Calibri" w:hAnsi="Calibri" w:eastAsia="黑体"/>
-                <w:b/>
-                <w:sz w:val="21"/>
-              </w:rPr>
-              <w:t>计产（本报告目标）</w:t>
-            </w:r>
-          </w:p>
-        </w:tc>
-        <w:tc>
-          <w:tcPr>
-            <w:tcW w:type="dxa" w:w="3855"/>
-          </w:tcPr>
-          <w:p>
-            <w:r/>
-            <w:r>
-              <w:rPr>
-                <w:rFonts w:ascii="Calibri" w:hAnsi="Calibri" w:eastAsia="黑体"/>
-                <w:b/>
-                <w:sz w:val="21"/>
-              </w:rPr>
-              <w:t>产量预测（不是目标）</w:t>
-            </w:r>
-          </w:p>
-        </w:tc>
-      </w:tr>
-      <w:tr>
-        <w:tc>
-          <w:tcPr>
-            <w:tcW w:type="dxa" w:w="1361"/>
-          </w:tcPr>
-          <w:p>
-            <w:r/>
-            <w:r>
-              <w:rPr>
-                <w:rFonts w:ascii="Calibri" w:hAnsi="Calibri" w:eastAsia="宋体"/>
-                <w:sz w:val="20"/>
-              </w:rPr>
-              <w:t>问题</w:t>
-            </w:r>
-          </w:p>
-        </w:tc>
-        <w:tc>
-          <w:tcPr>
-            <w:tcW w:type="dxa" w:w="3855"/>
-          </w:tcPr>
-          <w:p>
-            <w:r/>
-            <w:r>
-              <w:rPr>
-                <w:rFonts w:ascii="Calibri" w:hAnsi="Calibri" w:eastAsia="宋体"/>
-                <w:sz w:val="20"/>
-              </w:rPr>
-              <w:t>这口井现在产多少？</w:t>
-            </w:r>
-          </w:p>
-        </w:tc>
-        <w:tc>
-          <w:tcPr>
-            <w:tcW w:type="dxa" w:w="3855"/>
-          </w:tcPr>
-          <w:p>
-            <w:r/>
-            <w:r>
-              <w:rPr>
-                <w:rFonts w:ascii="Calibri" w:hAnsi="Calibri" w:eastAsia="宋体"/>
-                <w:sz w:val="20"/>
-              </w:rPr>
-              <w:t>未来一周/一月产多少？</w:t>
-            </w:r>
-          </w:p>
-        </w:tc>
-      </w:tr>
-      <w:tr>
-        <w:tc>
-          <w:tcPr>
-            <w:tcW w:type="dxa" w:w="1361"/>
-          </w:tcPr>
-          <w:p>
-            <w:r/>
-            <w:r>
-              <w:rPr>
-                <w:rFonts w:ascii="Calibri" w:hAnsi="Calibri" w:eastAsia="宋体"/>
-                <w:sz w:val="20"/>
-              </w:rPr>
-              <w:t>输入</w:t>
-            </w:r>
-          </w:p>
-        </w:tc>
-        <w:tc>
-          <w:tcPr>
-            <w:tcW w:type="dxa" w:w="3855"/>
-          </w:tcPr>
-          <w:p>
-            <w:r/>
-            <w:r>
-              <w:rPr>
-                <w:rFonts w:ascii="Calibri" w:hAnsi="Calibri" w:eastAsia="宋体"/>
-                <w:sz w:val="20"/>
-              </w:rPr>
-              <w:t>当前泵工况（转速、扭矩、电流、压温…）</w:t>
-            </w:r>
-          </w:p>
-        </w:tc>
-        <w:tc>
-          <w:tcPr>
-            <w:tcW w:type="dxa" w:w="3855"/>
-          </w:tcPr>
-          <w:p>
-            <w:r/>
-            <w:r>
-              <w:rPr>
-                <w:rFonts w:ascii="Calibri" w:hAnsi="Calibri" w:eastAsia="宋体"/>
-                <w:sz w:val="20"/>
-              </w:rPr>
-              <w:t>历史产量序列</w:t>
-            </w:r>
-          </w:p>
-        </w:tc>
-      </w:tr>
-      <w:tr>
-        <w:tc>
-          <w:tcPr>
-            <w:tcW w:type="dxa" w:w="1361"/>
-          </w:tcPr>
-          <w:p>
-            <w:r/>
-            <w:r>
-              <w:rPr>
-                <w:rFonts w:ascii="Calibri" w:hAnsi="Calibri" w:eastAsia="宋体"/>
-                <w:sz w:val="20"/>
-              </w:rPr>
-              <w:t>输出</w:t>
-            </w:r>
-          </w:p>
-        </w:tc>
-        <w:tc>
-          <w:tcPr>
-            <w:tcW w:type="dxa" w:w="3855"/>
-          </w:tcPr>
-          <w:p>
-            <w:r/>
-            <w:r>
-              <w:rPr>
-                <w:rFonts w:ascii="Calibri" w:hAnsi="Calibri" w:eastAsia="宋体"/>
-                <w:sz w:val="20"/>
-              </w:rPr>
-              <w:t>当前油/液产量</w:t>
-            </w:r>
-          </w:p>
-        </w:tc>
-        <w:tc>
-          <w:tcPr>
-            <w:tcW w:type="dxa" w:w="3855"/>
-          </w:tcPr>
-          <w:p>
-            <w:r/>
-            <w:r>
-              <w:rPr>
-                <w:rFonts w:ascii="Calibri" w:hAnsi="Calibri" w:eastAsia="宋体"/>
-                <w:sz w:val="20"/>
-              </w:rPr>
-              <w:t>未来产量</w:t>
-            </w:r>
-          </w:p>
-        </w:tc>
-      </w:tr>
-      <w:tr>
-        <w:tc>
-          <w:tcPr>
-            <w:tcW w:type="dxa" w:w="1361"/>
-          </w:tcPr>
-          <w:p>
-            <w:r/>
-            <w:r>
-              <w:rPr>
-                <w:rFonts w:ascii="Calibri" w:hAnsi="Calibri" w:eastAsia="宋体"/>
-                <w:sz w:val="20"/>
-              </w:rPr>
-              <w:t>用途</w:t>
-            </w:r>
-          </w:p>
-        </w:tc>
-        <w:tc>
-          <w:tcPr>
-            <w:tcW w:type="dxa" w:w="3855"/>
-          </w:tcPr>
-          <w:p>
-            <w:r/>
-            <w:r>
-              <w:rPr>
-                <w:rFonts w:ascii="Calibri" w:hAnsi="Calibri" w:eastAsia="宋体"/>
-                <w:sz w:val="20"/>
-              </w:rPr>
-              <w:t>替代/补充流量计、试井间隔内连续计量</w:t>
-            </w:r>
-          </w:p>
-        </w:tc>
-        <w:tc>
-          <w:tcPr>
-            <w:tcW w:type="dxa" w:w="3855"/>
-          </w:tcPr>
-          <w:p>
-            <w:r/>
-            <w:r>
-              <w:rPr>
-                <w:rFonts w:ascii="Calibri" w:hAnsi="Calibri" w:eastAsia="宋体"/>
-                <w:sz w:val="20"/>
-              </w:rPr>
-              <w:t>产量规划、递减分析</w:t>
-            </w:r>
-          </w:p>
-        </w:tc>
-      </w:tr>
-    </w:tbl>
-    <w:p/>
-    <w:p>
-      <w:pPr>
-        <w:pStyle w:val="Heading2"/>
-      </w:pPr>
-      <w:r>
-        <w:rPr>
-          <w:rFonts w:ascii="Calibri" w:hAnsi="Calibri" w:eastAsia="黑体"/>
-          <w:b/>
-          <w:color w:val="1F4E79"/>
-          <w:sz w:val="26"/>
-        </w:rPr>
-        <w:t>2.2 螺杆泵井为什么不能用油嘴计产模型</w:t>
-      </w:r>
-    </w:p>
-    <w:p>
-      <w:pPr>
-        <w:spacing w:after="120"/>
-        <w:ind w:firstLine="420"/>
-      </w:pPr>
-      <w:r>
-        <w:rPr>
-          <w:rFonts w:ascii="Calibri" w:hAnsi="Calibri" w:eastAsia="宋体"/>
-          <w:b w:val="0"/>
-          <w:sz w:val="21"/>
-        </w:rPr>
-        <w:t>自喷井产量主要由油嘴控制，信息源是油嘴尺寸与压差；螺杆泵井产量由泵控制，井口通常无可调油嘴，信息源是转速、扭矩/电流与泵两端压差。油嘴 NN/经验式对螺杆泵井不直接适用。</w:t>
-      </w:r>
-    </w:p>
-    <w:p>
-      <w:pPr>
-        <w:pStyle w:val="Heading2"/>
-      </w:pPr>
-      <w:r>
-        <w:rPr>
-          <w:rFonts w:ascii="Calibri" w:hAnsi="Calibri" w:eastAsia="黑体"/>
-          <w:b/>
-          <w:color w:val="1F4E79"/>
-          <w:sz w:val="26"/>
-        </w:rPr>
-        <w:t>2.3 机理计产概论：一条流动链 + 三个辅助模型</w:t>
-      </w:r>
-    </w:p>
-    <w:p>
-      <w:pPr>
-        <w:spacing w:after="120"/>
-        <w:ind w:firstLine="420"/>
-      </w:pPr>
-      <w:r>
-        <w:rPr>
-          <w:rFonts w:ascii="Calibri" w:hAnsi="Calibri" w:eastAsia="宋体"/>
-          <w:b w:val="0"/>
-          <w:sz w:val="21"/>
-        </w:rPr>
-        <w:t>流动路径：地层 → 泵吸入口 → 螺杆泵（增压）→ 油管井筒 → 井口 → 地面。稳态时各段流量相同、压力在接点连续。把各段「压力–流量」约束联立求解，得到的工作点流量就是产量。三个辅助模型分工如下：</w:t>
-      </w:r>
-    </w:p>
-    <w:tbl>
-      <w:tblPr>
-        <w:tblStyle w:val="LightGrid-Accent1"/>
-        <w:tblW w:type="auto" w:w="0"/>
-        <w:jc w:val="center"/>
-        <w:tblLook w:firstColumn="1" w:firstRow="1" w:lastColumn="0" w:lastRow="0" w:noHBand="0" w:noVBand="1" w:val="04A0"/>
-      </w:tblPr>
-      <w:tblGrid>
-        <w:gridCol w:w="2161"/>
-        <w:gridCol w:w="2161"/>
-        <w:gridCol w:w="2161"/>
-        <w:gridCol w:w="2161"/>
-      </w:tblGrid>
-      <w:tr>
-        <w:tc>
-          <w:tcPr>
-            <w:tcW w:type="dxa" w:w="1928"/>
-          </w:tcPr>
-          <w:p>
-            <w:r/>
-            <w:r>
-              <w:rPr>
-                <w:rFonts w:ascii="Calibri" w:hAnsi="Calibri" w:eastAsia="黑体"/>
-                <w:b/>
-                <w:sz w:val="21"/>
-              </w:rPr>
-              <w:t>辅助模型</w:t>
-            </w:r>
-          </w:p>
-        </w:tc>
-        <w:tc>
-          <w:tcPr>
-            <w:tcW w:type="dxa" w:w="1701"/>
-          </w:tcPr>
-          <w:p>
-            <w:r/>
-            <w:r>
-              <w:rPr>
-                <w:rFonts w:ascii="Calibri" w:hAnsi="Calibri" w:eastAsia="黑体"/>
-                <w:b/>
-                <w:sz w:val="21"/>
-              </w:rPr>
-              <w:t>管哪一段</w:t>
-            </w:r>
-          </w:p>
-        </w:tc>
-        <w:tc>
-          <w:tcPr>
-            <w:tcW w:type="dxa" w:w="2835"/>
-          </w:tcPr>
-          <w:p>
-            <w:r/>
-            <w:r>
-              <w:rPr>
-                <w:rFonts w:ascii="Calibri" w:hAnsi="Calibri" w:eastAsia="黑体"/>
-                <w:b/>
-                <w:sz w:val="21"/>
-              </w:rPr>
-              <w:t>输入 → 输出</w:t>
-            </w:r>
-          </w:p>
-        </w:tc>
-        <w:tc>
-          <w:tcPr>
-            <w:tcW w:type="dxa" w:w="2608"/>
-          </w:tcPr>
-          <w:p>
-            <w:r/>
-            <w:r>
-              <w:rPr>
-                <w:rFonts w:ascii="Calibri" w:hAnsi="Calibri" w:eastAsia="黑体"/>
-                <w:b/>
-                <w:sz w:val="21"/>
-              </w:rPr>
-              <w:t>在计产中的作用</w:t>
-            </w:r>
-          </w:p>
-        </w:tc>
-      </w:tr>
-      <w:tr>
-        <w:tc>
-          <w:tcPr>
-            <w:tcW w:type="dxa" w:w="1928"/>
-          </w:tcPr>
-          <w:p>
-            <w:r/>
-            <w:r>
-              <w:rPr>
-                <w:rFonts w:ascii="Calibri" w:hAnsi="Calibri" w:eastAsia="宋体"/>
-                <w:sz w:val="20"/>
-              </w:rPr>
-              <w:t>螺杆泵运行特性模型（核心）</w:t>
-            </w:r>
-          </w:p>
-        </w:tc>
-        <w:tc>
-          <w:tcPr>
-            <w:tcW w:type="dxa" w:w="1701"/>
-          </w:tcPr>
-          <w:p>
-            <w:r/>
-            <w:r>
-              <w:rPr>
-                <w:rFonts w:ascii="Calibri" w:hAnsi="Calibri" w:eastAsia="宋体"/>
-                <w:sz w:val="20"/>
-              </w:rPr>
-              <w:t>泵段</w:t>
-            </w:r>
-          </w:p>
-        </w:tc>
-        <w:tc>
-          <w:tcPr>
-            <w:tcW w:type="dxa" w:w="2835"/>
-          </w:tcPr>
-          <w:p>
-            <w:r/>
-            <w:r>
-              <w:rPr>
-                <w:rFonts w:ascii="Calibri" w:hAnsi="Calibri" w:eastAsia="宋体"/>
-                <w:sz w:val="20"/>
-              </w:rPr>
-              <w:t>转速、泵压差、黏度、泵几何 → 实际排量、扭矩</w:t>
-            </w:r>
-          </w:p>
-        </w:tc>
-        <w:tc>
-          <w:tcPr>
-            <w:tcW w:type="dxa" w:w="2608"/>
-          </w:tcPr>
-          <w:p>
-            <w:r/>
-            <w:r>
-              <w:rPr>
-                <w:rFonts w:ascii="Calibri" w:hAnsi="Calibri" w:eastAsia="宋体"/>
-                <w:sz w:val="20"/>
-              </w:rPr>
-              <w:t>直接给出产量：Q = Q理论 − Q滑脱；是「计量元件」</w:t>
-            </w:r>
-          </w:p>
-        </w:tc>
-      </w:tr>
-      <w:tr>
-        <w:tc>
-          <w:tcPr>
-            <w:tcW w:type="dxa" w:w="1928"/>
-          </w:tcPr>
-          <w:p>
-            <w:r/>
-            <w:r>
-              <w:rPr>
-                <w:rFonts w:ascii="Calibri" w:hAnsi="Calibri" w:eastAsia="宋体"/>
-                <w:sz w:val="20"/>
-              </w:rPr>
-              <w:t>井筒流体运移模型（辅助）</w:t>
-            </w:r>
-          </w:p>
-        </w:tc>
-        <w:tc>
-          <w:tcPr>
-            <w:tcW w:type="dxa" w:w="1701"/>
-          </w:tcPr>
-          <w:p>
-            <w:r/>
-            <w:r>
-              <w:rPr>
-                <w:rFonts w:ascii="Calibri" w:hAnsi="Calibri" w:eastAsia="宋体"/>
-                <w:sz w:val="20"/>
-              </w:rPr>
-              <w:t>泵出口→井口油管（及环空液柱）</w:t>
-            </w:r>
-          </w:p>
-        </w:tc>
-        <w:tc>
-          <w:tcPr>
-            <w:tcW w:type="dxa" w:w="2835"/>
-          </w:tcPr>
-          <w:p>
-            <w:r/>
-            <w:r>
-              <w:rPr>
-                <w:rFonts w:ascii="Calibri" w:hAnsi="Calibri" w:eastAsia="宋体"/>
-                <w:sz w:val="20"/>
-              </w:rPr>
-              <w:t>流量、边界压力、管径井斜、PVT → 沿程压力/温度/持液率</w:t>
-            </w:r>
-          </w:p>
-        </w:tc>
-        <w:tc>
-          <w:tcPr>
-            <w:tcW w:type="dxa" w:w="2608"/>
-          </w:tcPr>
-          <w:p>
-            <w:r/>
-            <w:r>
-              <w:rPr>
-                <w:rFonts w:ascii="Calibri" w:hAnsi="Calibri" w:eastAsia="宋体"/>
-                <w:sz w:val="20"/>
-              </w:rPr>
-              <w:t>算出泵出口压力或回压，从而得到泵压差</w:t>
-            </w:r>
-          </w:p>
-        </w:tc>
-      </w:tr>
-      <w:tr>
-        <w:tc>
-          <w:tcPr>
-            <w:tcW w:type="dxa" w:w="1928"/>
-          </w:tcPr>
-          <w:p>
-            <w:r/>
-            <w:r>
-              <w:rPr>
-                <w:rFonts w:ascii="Calibri" w:hAnsi="Calibri" w:eastAsia="宋体"/>
-                <w:sz w:val="20"/>
-              </w:rPr>
-              <w:t>井筒流体摩阻计算模型（辅助）</w:t>
-            </w:r>
-          </w:p>
-        </w:tc>
-        <w:tc>
-          <w:tcPr>
-            <w:tcW w:type="dxa" w:w="1701"/>
-          </w:tcPr>
-          <w:p>
-            <w:r/>
-            <w:r>
-              <w:rPr>
-                <w:rFonts w:ascii="Calibri" w:hAnsi="Calibri" w:eastAsia="宋体"/>
-                <w:sz w:val="20"/>
-              </w:rPr>
-              <w:t>运移模型内部的摩阻压降项</w:t>
-            </w:r>
-          </w:p>
-        </w:tc>
-        <w:tc>
-          <w:tcPr>
-            <w:tcW w:type="dxa" w:w="2835"/>
-          </w:tcPr>
-          <w:p>
-            <w:r/>
-            <w:r>
-              <w:rPr>
-                <w:rFonts w:ascii="Calibri" w:hAnsi="Calibri" w:eastAsia="宋体"/>
-                <w:sz w:val="20"/>
-              </w:rPr>
-              <w:t>流速、管径、粗糙度、物性 → ΔP摩阻</w:t>
-            </w:r>
-          </w:p>
-        </w:tc>
-        <w:tc>
-          <w:tcPr>
-            <w:tcW w:type="dxa" w:w="2608"/>
-          </w:tcPr>
-          <w:p>
-            <w:r/>
-            <w:r>
-              <w:rPr>
-                <w:rFonts w:ascii="Calibri" w:hAnsi="Calibri" w:eastAsia="宋体"/>
-                <w:sz w:val="20"/>
-              </w:rPr>
-              <w:t>运移模型的组成部分，影响泵压差精度</w:t>
-            </w:r>
-          </w:p>
-        </w:tc>
-      </w:tr>
-    </w:tbl>
-    <w:p/>
-    <w:p>
-      <w:pPr>
-        <w:pStyle w:val="Heading2"/>
-      </w:pPr>
-      <w:r>
-        <w:rPr>
-          <w:rFonts w:ascii="Calibri" w:hAnsi="Calibri" w:eastAsia="黑体"/>
-          <w:b/>
-          <w:color w:val="1F4E79"/>
-          <w:sz w:val="26"/>
-        </w:rPr>
-        <w:t>2.4 机理计产求解流程（六步）</w:t>
-      </w:r>
-    </w:p>
-    <w:p>
-      <w:pPr>
-        <w:spacing w:after="120"/>
-        <w:ind w:firstLine="420"/>
-      </w:pPr>
-      <w:r>
-        <w:rPr>
-          <w:rFonts w:ascii="Calibri" w:hAnsi="Calibri" w:eastAsia="宋体"/>
-          <w:b w:val="0"/>
-          <w:sz w:val="21"/>
-        </w:rPr>
-        <w:t>已知转速与井口压力、求产量时：</w:t>
-      </w:r>
-    </w:p>
-    <w:p>
-      <w:pPr>
-        <w:spacing w:after="120"/>
-        <w:ind w:firstLine="420"/>
-      </w:pPr>
-      <w:r>
-        <w:rPr>
-          <w:rFonts w:ascii="Calibri" w:hAnsi="Calibri" w:eastAsia="宋体"/>
-          <w:b w:val="0"/>
-          <w:sz w:val="21"/>
-        </w:rPr>
-        <w:t>① 准备：泵几何、转速、井口油压、流体物性、井身与泵挂深度。② 假设试探产量 Q。③ 井筒运移（内含摩阻）从井口积分到泵出口 → P_out；结合吸入口压力或动液面得 P_in；泵压差 ΔP = P_out − P_in。④ 泵特性：Q_th = C×转速；Q_slip = f(ΔP, 黏度, 间隙…)；Q_pump = Q_th − Q_slip。⑤ 比较 Q_pump 与假设 Q，不一致则修正假设，回到③；一致则该 Q 为产量。⑥（可选）用 IPR 校核泵吸入口压力与地层供液是否匹配。</w:t>
-      </w:r>
-    </w:p>
-    <w:p>
-      <w:pPr>
-        <w:spacing w:after="120"/>
-        <w:ind w:firstLine="420"/>
-      </w:pPr>
-      <w:r>
-        <w:rPr>
-          <w:rFonts w:ascii="Calibri" w:hAnsi="Calibri" w:eastAsia="宋体"/>
-          <w:b w:val="0"/>
-          <w:sz w:val="21"/>
-        </w:rPr>
-        <w:t>神经网络计产学的就是「转速、扭矩/电流、井口压、沉没度… → Q」这条映射；混合结构则固定 Q_th = C×n，只让网络学 Q_slip。</w:t>
-      </w:r>
-    </w:p>
-    <w:p>
-      <w:pPr>
-        <w:pStyle w:val="Heading1"/>
-      </w:pPr>
-      <w:r>
-        <w:rPr>
-          <w:rFonts w:ascii="Calibri" w:hAnsi="Calibri" w:eastAsia="黑体"/>
-          <w:b/>
-          <w:color w:val="1F4E79"/>
-          <w:sz w:val="32"/>
-        </w:rPr>
-        <w:t>三、三个辅助模型的开源实现（服务计产，不是计产 NN 本身）</w:t>
-      </w:r>
-    </w:p>
-    <w:p>
-      <w:pPr>
-        <w:spacing w:after="160"/>
-      </w:pPr>
-      <w:r>
-        <w:rPr>
-          <w:rFonts w:ascii="Calibri" w:hAnsi="Calibri" w:eastAsia="黑体"/>
-          <w:b/>
-          <w:color w:val="1F4E79"/>
-          <w:sz w:val="21"/>
-        </w:rPr>
-        <w:t>【本章概述】</w:t>
-      </w:r>
-      <w:r>
-        <w:rPr>
-          <w:rFonts w:ascii="Calibri" w:hAnsi="Calibri" w:eastAsia="宋体"/>
-          <w:sz w:val="21"/>
-        </w:rPr>
-        <w:t>本章是辅线。井筒运移/摩阻有成熟开源库，可用来算泵压差特征；泵特性目前没有开源代码，只有论文公式需自写。它们不能替代神经网络计产，但可嵌入混合模型。</w:t>
-      </w:r>
-    </w:p>
-    <w:p>
-      <w:pPr>
-        <w:pStyle w:val="Heading2"/>
-      </w:pPr>
-      <w:r>
-        <w:rPr>
-          <w:rFonts w:ascii="Calibri" w:hAnsi="Calibri" w:eastAsia="黑体"/>
-          <w:b/>
-          <w:color w:val="1F4E79"/>
-          <w:sz w:val="26"/>
-        </w:rPr>
-        <w:t>3.1 井筒流体运移模型</w:t>
-      </w:r>
-    </w:p>
-    <w:tbl>
-      <w:tblPr>
-        <w:tblStyle w:val="LightGrid-Accent1"/>
-        <w:tblW w:type="auto" w:w="0"/>
-        <w:jc w:val="center"/>
-        <w:tblLook w:firstColumn="1" w:firstRow="1" w:lastColumn="0" w:lastRow="0" w:noHBand="0" w:noVBand="1" w:val="04A0"/>
-      </w:tblPr>
-      <w:tblGrid>
-        <w:gridCol w:w="2882"/>
-        <w:gridCol w:w="2882"/>
-        <w:gridCol w:w="2882"/>
-      </w:tblGrid>
-      <w:tr>
-        <w:tc>
-          <w:tcPr>
-            <w:tcW w:type="dxa" w:w="1814"/>
-          </w:tcPr>
-          <w:p>
-            <w:r/>
-            <w:r>
-              <w:rPr>
-                <w:rFonts w:ascii="Calibri" w:hAnsi="Calibri" w:eastAsia="黑体"/>
-                <w:b/>
-                <w:sz w:val="21"/>
-              </w:rPr>
-              <w:t>项目</w:t>
-            </w:r>
-          </w:p>
-        </w:tc>
-        <w:tc>
-          <w:tcPr>
-            <w:tcW w:type="dxa" w:w="3061"/>
-          </w:tcPr>
-          <w:p>
-            <w:r/>
-            <w:r>
-              <w:rPr>
-                <w:rFonts w:ascii="Calibri" w:hAnsi="Calibri" w:eastAsia="黑体"/>
-                <w:b/>
-                <w:sz w:val="21"/>
-              </w:rPr>
-              <w:t>地址</w:t>
-            </w:r>
-          </w:p>
-        </w:tc>
-        <w:tc>
-          <w:tcPr>
-            <w:tcW w:type="dxa" w:w="4195"/>
-          </w:tcPr>
-          <w:p>
-            <w:r/>
-            <w:r>
-              <w:rPr>
-                <w:rFonts w:ascii="Calibri" w:hAnsi="Calibri" w:eastAsia="黑体"/>
-                <w:b/>
-                <w:sz w:val="21"/>
-              </w:rPr>
-              <w:t>说明</w:t>
-            </w:r>
-          </w:p>
-        </w:tc>
-      </w:tr>
-      <w:tr>
-        <w:tc>
-          <w:tcPr>
-            <w:tcW w:type="dxa" w:w="1814"/>
-          </w:tcPr>
-          <w:p>
-            <w:r/>
-            <w:r>
-              <w:rPr>
-                <w:rFonts w:ascii="Calibri" w:hAnsi="Calibri" w:eastAsia="宋体"/>
-                <w:sz w:val="20"/>
-              </w:rPr>
-              <w:t>marlim3</w:t>
-            </w:r>
-          </w:p>
-        </w:tc>
-        <w:tc>
-          <w:tcPr>
-            <w:tcW w:type="dxa" w:w="3061"/>
-          </w:tcPr>
-          <w:p>
-            <w:r/>
-            <w:r>
-              <w:rPr>
-                <w:rFonts w:ascii="Calibri" w:hAnsi="Calibri" w:eastAsia="宋体"/>
-                <w:sz w:val="20"/>
-              </w:rPr>
-              <w:t>github.com/petrobras/marlim3</w:t>
-              <w:br/>
-              <w:t>pip install marlim3</w:t>
-            </w:r>
-          </w:p>
-        </w:tc>
-        <w:tc>
-          <w:tcPr>
-            <w:tcW w:type="dxa" w:w="4195"/>
-          </w:tcPr>
-          <w:p>
-            <w:r/>
-            <w:r>
-              <w:rPr>
-                <w:rFonts w:ascii="Calibri" w:hAnsi="Calibri" w:eastAsia="宋体"/>
-                <w:sz w:val="20"/>
-              </w:rPr>
-              <w:t>Petrobras 1D 瞬态多相流模拟器（生产井/管网/热耦合）</w:t>
-            </w:r>
-          </w:p>
-        </w:tc>
-      </w:tr>
-      <w:tr>
-        <w:tc>
-          <w:tcPr>
-            <w:tcW w:type="dxa" w:w="1814"/>
-          </w:tcPr>
-          <w:p>
-            <w:r/>
-            <w:r>
-              <w:rPr>
-                <w:rFonts w:ascii="Calibri" w:hAnsi="Calibri" w:eastAsia="宋体"/>
-                <w:sz w:val="20"/>
-              </w:rPr>
-              <w:t>ManyWells</w:t>
-            </w:r>
-          </w:p>
-        </w:tc>
-        <w:tc>
-          <w:tcPr>
-            <w:tcW w:type="dxa" w:w="3061"/>
-          </w:tcPr>
-          <w:p>
-            <w:r/>
-            <w:r>
-              <w:rPr>
-                <w:rFonts w:ascii="Calibri" w:hAnsi="Calibri" w:eastAsia="宋体"/>
-                <w:sz w:val="20"/>
-              </w:rPr>
-              <w:t>github.com/solution-seeker-as/manywells</w:t>
-            </w:r>
-          </w:p>
-        </w:tc>
-        <w:tc>
-          <w:tcPr>
-            <w:tcW w:type="dxa" w:w="4195"/>
-          </w:tcPr>
-          <w:p>
-            <w:r/>
-            <w:r>
-              <w:rPr>
-                <w:rFonts w:ascii="Calibri" w:hAnsi="Calibri" w:eastAsia="宋体"/>
-                <w:sz w:val="20"/>
-              </w:rPr>
-              <w:t>Python 稳态漂移流井筒模拟器 + 百万点基准数据</w:t>
-            </w:r>
-          </w:p>
-        </w:tc>
-      </w:tr>
-      <w:tr>
-        <w:tc>
-          <w:tcPr>
-            <w:tcW w:type="dxa" w:w="1814"/>
-          </w:tcPr>
-          <w:p>
-            <w:r/>
-            <w:r>
-              <w:rPr>
-                <w:rFonts w:ascii="Calibri" w:hAnsi="Calibri" w:eastAsia="宋体"/>
-                <w:sz w:val="20"/>
-              </w:rPr>
-              <w:t>NeqSim TransientPipe</w:t>
-            </w:r>
-          </w:p>
-        </w:tc>
-        <w:tc>
-          <w:tcPr>
-            <w:tcW w:type="dxa" w:w="3061"/>
-          </w:tcPr>
-          <w:p>
-            <w:r/>
-            <w:r>
-              <w:rPr>
-                <w:rFonts w:ascii="Calibri" w:hAnsi="Calibri" w:eastAsia="宋体"/>
-                <w:sz w:val="20"/>
-              </w:rPr>
-              <w:t>github.com/equinor/neqsim</w:t>
-            </w:r>
-          </w:p>
-        </w:tc>
-        <w:tc>
-          <w:tcPr>
-            <w:tcW w:type="dxa" w:w="4195"/>
-          </w:tcPr>
-          <w:p>
-            <w:r/>
-            <w:r>
-              <w:rPr>
-                <w:rFonts w:ascii="Calibri" w:hAnsi="Calibri" w:eastAsia="宋体"/>
-                <w:sz w:val="20"/>
-              </w:rPr>
-              <w:t>瞬态漂移流 + 流型判别 + 段塞追踪 + EOS 闪蒸</w:t>
-            </w:r>
-          </w:p>
-        </w:tc>
-      </w:tr>
-    </w:tbl>
-    <w:p/>
-    <w:p>
-      <w:pPr>
-        <w:pStyle w:val="Heading2"/>
-      </w:pPr>
-      <w:r>
-        <w:rPr>
-          <w:rFonts w:ascii="Calibri" w:hAnsi="Calibri" w:eastAsia="黑体"/>
-          <w:b/>
-          <w:color w:val="1F4E79"/>
-          <w:sz w:val="26"/>
-        </w:rPr>
-        <w:t>3.2 井筒流体摩阻计算模型</w:t>
-      </w:r>
-    </w:p>
-    <w:tbl>
-      <w:tblPr>
-        <w:tblStyle w:val="LightGrid-Accent1"/>
-        <w:tblW w:type="auto" w:w="0"/>
-        <w:jc w:val="center"/>
-        <w:tblLook w:firstColumn="1" w:firstRow="1" w:lastColumn="0" w:lastRow="0" w:noHBand="0" w:noVBand="1" w:val="04A0"/>
-      </w:tblPr>
-      <w:tblGrid>
-        <w:gridCol w:w="2882"/>
-        <w:gridCol w:w="2882"/>
-        <w:gridCol w:w="2882"/>
-      </w:tblGrid>
-      <w:tr>
-        <w:tc>
-          <w:tcPr>
-            <w:tcW w:type="dxa" w:w="1814"/>
-          </w:tcPr>
-          <w:p>
-            <w:r/>
-            <w:r>
-              <w:rPr>
-                <w:rFonts w:ascii="Calibri" w:hAnsi="Calibri" w:eastAsia="黑体"/>
-                <w:b/>
-                <w:sz w:val="21"/>
-              </w:rPr>
-              <w:t>项目</w:t>
-            </w:r>
-          </w:p>
-        </w:tc>
-        <w:tc>
-          <w:tcPr>
-            <w:tcW w:type="dxa" w:w="3061"/>
-          </w:tcPr>
-          <w:p>
-            <w:r/>
-            <w:r>
-              <w:rPr>
-                <w:rFonts w:ascii="Calibri" w:hAnsi="Calibri" w:eastAsia="黑体"/>
-                <w:b/>
-                <w:sz w:val="21"/>
-              </w:rPr>
-              <w:t>地址</w:t>
-            </w:r>
-          </w:p>
-        </w:tc>
-        <w:tc>
-          <w:tcPr>
-            <w:tcW w:type="dxa" w:w="4195"/>
-          </w:tcPr>
-          <w:p>
-            <w:r/>
-            <w:r>
-              <w:rPr>
-                <w:rFonts w:ascii="Calibri" w:hAnsi="Calibri" w:eastAsia="黑体"/>
-                <w:b/>
-                <w:sz w:val="21"/>
-              </w:rPr>
-              <w:t>说明</w:t>
-            </w:r>
-          </w:p>
-        </w:tc>
-      </w:tr>
-      <w:tr>
-        <w:tc>
-          <w:tcPr>
-            <w:tcW w:type="dxa" w:w="1814"/>
-          </w:tcPr>
-          <w:p>
-            <w:r/>
-            <w:r>
-              <w:rPr>
-                <w:rFonts w:ascii="Calibri" w:hAnsi="Calibri" w:eastAsia="宋体"/>
-                <w:sz w:val="20"/>
-              </w:rPr>
-              <w:t>flotech</w:t>
-            </w:r>
-          </w:p>
-        </w:tc>
-        <w:tc>
-          <w:tcPr>
-            <w:tcW w:type="dxa" w:w="3061"/>
-          </w:tcPr>
-          <w:p>
-            <w:r/>
-            <w:r>
-              <w:rPr>
-                <w:rFonts w:ascii="Calibri" w:hAnsi="Calibri" w:eastAsia="宋体"/>
-                <w:sz w:val="20"/>
-              </w:rPr>
-              <w:t>pip install flotech</w:t>
-            </w:r>
-          </w:p>
-        </w:tc>
-        <w:tc>
-          <w:tcPr>
-            <w:tcW w:type="dxa" w:w="4195"/>
-          </w:tcPr>
-          <w:p>
-            <w:r/>
-            <w:r>
-              <w:rPr>
-                <w:rFonts w:ascii="Calibri" w:hAnsi="Calibri" w:eastAsia="宋体"/>
-                <w:sz w:val="20"/>
-              </w:rPr>
-              <w:t>Beggs &amp; Brill、Duns &amp; Ros、Ansari、Gray 等压降关联式 + PVT + IPR</w:t>
-            </w:r>
-          </w:p>
-        </w:tc>
-      </w:tr>
-      <w:tr>
-        <w:tc>
-          <w:tcPr>
-            <w:tcW w:type="dxa" w:w="1814"/>
-          </w:tcPr>
-          <w:p>
-            <w:r/>
-            <w:r>
-              <w:rPr>
-                <w:rFonts w:ascii="Calibri" w:hAnsi="Calibri" w:eastAsia="宋体"/>
-                <w:sz w:val="20"/>
-              </w:rPr>
-              <w:t>pyResToolbox</w:t>
-            </w:r>
-          </w:p>
-        </w:tc>
-        <w:tc>
-          <w:tcPr>
-            <w:tcW w:type="dxa" w:w="3061"/>
-          </w:tcPr>
-          <w:p>
-            <w:r/>
-            <w:r>
-              <w:rPr>
-                <w:rFonts w:ascii="Calibri" w:hAnsi="Calibri" w:eastAsia="宋体"/>
-                <w:sz w:val="20"/>
-              </w:rPr>
-              <w:t>github.com/mwburgoyne/pyResToolbox</w:t>
-            </w:r>
-          </w:p>
-        </w:tc>
-        <w:tc>
-          <w:tcPr>
-            <w:tcW w:type="dxa" w:w="4195"/>
-          </w:tcPr>
-          <w:p>
-            <w:r/>
-            <w:r>
-              <w:rPr>
-                <w:rFonts w:ascii="Calibri" w:hAnsi="Calibri" w:eastAsia="宋体"/>
-                <w:sz w:val="20"/>
-              </w:rPr>
-              <w:t>VLP（含 Hagedorn–Brown 等）+ 节点分析 + Eclipse VFP 表</w:t>
-            </w:r>
-          </w:p>
-        </w:tc>
-      </w:tr>
-      <w:tr>
-        <w:tc>
-          <w:tcPr>
-            <w:tcW w:type="dxa" w:w="1814"/>
-          </w:tcPr>
-          <w:p>
-            <w:r/>
-            <w:r>
-              <w:rPr>
-                <w:rFonts w:ascii="Calibri" w:hAnsi="Calibri" w:eastAsia="宋体"/>
-                <w:sz w:val="20"/>
-              </w:rPr>
-              <w:t>petropt / fluids</w:t>
-            </w:r>
-          </w:p>
-        </w:tc>
-        <w:tc>
-          <w:tcPr>
-            <w:tcW w:type="dxa" w:w="3061"/>
-          </w:tcPr>
-          <w:p>
-            <w:r/>
-            <w:r>
-              <w:rPr>
-                <w:rFonts w:ascii="Calibri" w:hAnsi="Calibri" w:eastAsia="宋体"/>
-                <w:sz w:val="20"/>
-              </w:rPr>
-              <w:t>github.com/petropt/petropt</w:t>
-              <w:br/>
-              <w:t>github.com/CalebBell/fluids</w:t>
-            </w:r>
-          </w:p>
-        </w:tc>
-        <w:tc>
-          <w:tcPr>
-            <w:tcW w:type="dxa" w:w="4195"/>
-          </w:tcPr>
-          <w:p>
-            <w:r/>
-            <w:r>
-              <w:rPr>
-                <w:rFonts w:ascii="Calibri" w:hAnsi="Calibri" w:eastAsia="宋体"/>
-                <w:sz w:val="20"/>
-              </w:rPr>
-              <w:t>Beggs–Brill、Darcy–Weisbach、多种摩阻系数</w:t>
-            </w:r>
-          </w:p>
-        </w:tc>
-      </w:tr>
-    </w:tbl>
-    <w:p/>
-    <w:p>
-      <w:pPr>
-        <w:pStyle w:val="Heading2"/>
-      </w:pPr>
-      <w:r>
-        <w:rPr>
-          <w:rFonts w:ascii="Calibri" w:hAnsi="Calibri" w:eastAsia="黑体"/>
-          <w:b/>
-          <w:color w:val="1F4E79"/>
-          <w:sz w:val="26"/>
-        </w:rPr>
-        <w:t>3.3 螺杆泵运行特性模型（无开源成品，论文自写）</w:t>
-      </w:r>
-    </w:p>
-    <w:p>
-      <w:pPr>
-        <w:spacing w:after="120"/>
-        <w:ind w:firstLine="420"/>
-      </w:pPr>
-      <w:r>
-        <w:rPr>
-          <w:rFonts w:ascii="Calibri" w:hAnsi="Calibri" w:eastAsia="宋体"/>
-          <w:b w:val="0"/>
-          <w:sz w:val="21"/>
-        </w:rPr>
-        <w:t>核心公式：实际排量 = 理论排量 − 滑脱量；Q_th = C × 转速。开源现状：无现成库。可自写的论文：</w:t>
-      </w:r>
-    </w:p>
-    <w:p>
-      <w:pPr>
-        <w:pStyle w:val="ListBullet"/>
-        <w:spacing w:after="80"/>
-      </w:pPr>
-      <w:r>
-        <w:rPr>
-          <w:rFonts w:ascii="Calibri" w:hAnsi="Calibri" w:eastAsia="宋体"/>
-          <w:sz w:val="21"/>
-        </w:rPr>
-        <w:t>Gamboa 逐腔室质量平衡 / COBEM 2009 简化模型（推荐实现起点）；</w:t>
-      </w:r>
-    </w:p>
-    <w:p>
-      <w:pPr>
-        <w:pStyle w:val="ListBullet"/>
-        <w:spacing w:after="80"/>
-      </w:pPr>
-      <w:r>
-        <w:rPr>
-          <w:rFonts w:ascii="Calibri" w:hAnsi="Calibri" w:eastAsia="宋体"/>
-          <w:sz w:val="21"/>
-        </w:rPr>
-        <w:t>金属定子间隙滑脱解析模型（Math. Problems in Eng., 2018, DOI:10.1155/2018/3696930）；</w:t>
-      </w:r>
-    </w:p>
-    <w:p>
-      <w:pPr>
-        <w:pStyle w:val="ListBullet"/>
-        <w:spacing w:after="80"/>
-      </w:pPr>
-      <w:r>
-        <w:rPr>
-          <w:rFonts w:ascii="Calibri" w:hAnsi="Calibri" w:eastAsia="宋体"/>
-          <w:sz w:val="21"/>
-        </w:rPr>
-        <w:t>井下定子变形耦合模型（J. Pet. Sci. Eng., 2020）。</w:t>
-      </w:r>
-    </w:p>
-    <w:p>
-      <w:pPr>
-        <w:pStyle w:val="Heading1"/>
-      </w:pPr>
-      <w:r>
-        <w:rPr>
-          <w:rFonts w:ascii="Calibri" w:hAnsi="Calibri" w:eastAsia="黑体"/>
-          <w:b/>
-          <w:color w:val="1F4E79"/>
-          <w:sz w:val="32"/>
-        </w:rPr>
-        <w:t>四、螺杆泵井神经网络计产：自建路径（主路径）</w:t>
-      </w:r>
-    </w:p>
-    <w:p>
-      <w:pPr>
-        <w:spacing w:after="160"/>
-      </w:pPr>
-      <w:r>
-        <w:rPr>
-          <w:rFonts w:ascii="Calibri" w:hAnsi="Calibri" w:eastAsia="黑体"/>
-          <w:b/>
-          <w:color w:val="1F4E79"/>
-          <w:sz w:val="21"/>
-        </w:rPr>
-        <w:t>【本章概述】</w:t>
-      </w:r>
-      <w:r>
-        <w:rPr>
-          <w:rFonts w:ascii="Calibri" w:hAnsi="Calibri" w:eastAsia="宋体"/>
-          <w:sz w:val="21"/>
-        </w:rPr>
-        <w:t>既然没有成品开源，本章给出可执行的自建方案：特征集、两种网络结构、改哪些开源仓库、训练与验证步骤。这是你真正要落地时应跟随的章节。</w:t>
-      </w:r>
-    </w:p>
-    <w:p>
-      <w:pPr>
-        <w:pStyle w:val="Heading2"/>
-      </w:pPr>
-      <w:r>
-        <w:rPr>
-          <w:rFonts w:ascii="Calibri" w:hAnsi="Calibri" w:eastAsia="黑体"/>
-          <w:b/>
-          <w:color w:val="1F4E79"/>
-          <w:sz w:val="26"/>
-        </w:rPr>
-        <w:t>4.1 特征集（不要油嘴开度）</w:t>
-      </w:r>
-    </w:p>
-    <w:tbl>
-      <w:tblPr>
-        <w:tblStyle w:val="LightGrid-Accent1"/>
-        <w:tblW w:type="auto" w:w="0"/>
-        <w:jc w:val="center"/>
-        <w:tblLook w:firstColumn="1" w:firstRow="1" w:lastColumn="0" w:lastRow="0" w:noHBand="0" w:noVBand="1" w:val="04A0"/>
-      </w:tblPr>
-      <w:tblGrid>
-        <w:gridCol w:w="2882"/>
-        <w:gridCol w:w="2882"/>
-        <w:gridCol w:w="2882"/>
-      </w:tblGrid>
-      <w:tr>
-        <w:tc>
-          <w:tcPr>
-            <w:tcW w:type="dxa" w:w="1361"/>
-          </w:tcPr>
-          <w:p>
-            <w:r/>
-            <w:r>
-              <w:rPr>
-                <w:rFonts w:ascii="Calibri" w:hAnsi="Calibri" w:eastAsia="黑体"/>
-                <w:b/>
-                <w:sz w:val="21"/>
-              </w:rPr>
-              <w:t>优先级</w:t>
-            </w:r>
-          </w:p>
-        </w:tc>
-        <w:tc>
-          <w:tcPr>
-            <w:tcW w:type="dxa" w:w="2835"/>
+            <w:tcW w:type="dxa" w:w="2948"/>
           </w:tcPr>
           <w:p>
             <w:r/>
@@ -2493,7 +1020,7 @@
         </w:tc>
         <w:tc>
           <w:tcPr>
-            <w:tcW w:type="dxa" w:w="4876"/>
+            <w:tcW w:type="dxa" w:w="4762"/>
           </w:tcPr>
           <w:p>
             <w:r/>
@@ -2503,7 +1030,7 @@
                 <w:b/>
                 <w:sz w:val="21"/>
               </w:rPr>
-              <w:t>物理含义</w:t>
+              <w:t>作用</w:t>
             </w:r>
           </w:p>
         </w:tc>
@@ -2526,7 +1053,7 @@
         </w:tc>
         <w:tc>
           <w:tcPr>
-            <w:tcW w:type="dxa" w:w="2835"/>
+            <w:tcW w:type="dxa" w:w="2948"/>
           </w:tcPr>
           <w:p>
             <w:r/>
@@ -2535,13 +1062,13 @@
                 <w:rFonts w:ascii="Calibri" w:hAnsi="Calibri" w:eastAsia="宋体"/>
                 <w:sz w:val="20"/>
               </w:rPr>
-              <w:t>泵转速 / 电机频率</w:t>
+              <w:t>泵转速（或电机频率）</w:t>
             </w:r>
           </w:p>
         </w:tc>
         <w:tc>
           <w:tcPr>
-            <w:tcW w:type="dxa" w:w="4876"/>
+            <w:tcW w:type="dxa" w:w="4762"/>
           </w:tcPr>
           <w:p>
             <w:r/>
@@ -2550,7 +1077,7 @@
                 <w:rFonts w:ascii="Calibri" w:hAnsi="Calibri" w:eastAsia="宋体"/>
                 <w:sz w:val="20"/>
               </w:rPr>
-              <w:t>决定理论排量</w:t>
+              <w:t>决定理论排量，信息量最大</w:t>
             </w:r>
           </w:p>
         </w:tc>
@@ -2573,7 +1100,7 @@
         </w:tc>
         <w:tc>
           <w:tcPr>
-            <w:tcW w:type="dxa" w:w="2835"/>
+            <w:tcW w:type="dxa" w:w="2948"/>
           </w:tcPr>
           <w:p>
             <w:r/>
@@ -2582,13 +1109,13 @@
                 <w:rFonts w:ascii="Calibri" w:hAnsi="Calibri" w:eastAsia="宋体"/>
                 <w:sz w:val="20"/>
               </w:rPr>
-              <w:t>扭矩或电流 / 有功功率</w:t>
+              <w:t>扭矩，或电机电流/有功功率</w:t>
             </w:r>
           </w:p>
         </w:tc>
         <w:tc>
           <w:tcPr>
-            <w:tcW w:type="dxa" w:w="4876"/>
+            <w:tcW w:type="dxa" w:w="4762"/>
           </w:tcPr>
           <w:p>
             <w:r/>
@@ -2597,7 +1124,7 @@
                 <w:rFonts w:ascii="Calibri" w:hAnsi="Calibri" w:eastAsia="宋体"/>
                 <w:sz w:val="20"/>
               </w:rPr>
-              <w:t>编码泵压差与负荷、间接反映滑脱</w:t>
+              <w:t>反映泵压差与负荷</w:t>
             </w:r>
           </w:p>
         </w:tc>
@@ -2620,7 +1147,7 @@
         </w:tc>
         <w:tc>
           <w:tcPr>
-            <w:tcW w:type="dxa" w:w="2835"/>
+            <w:tcW w:type="dxa" w:w="2948"/>
           </w:tcPr>
           <w:p>
             <w:r/>
@@ -2635,7 +1162,7 @@
         </w:tc>
         <w:tc>
           <w:tcPr>
-            <w:tcW w:type="dxa" w:w="4876"/>
+            <w:tcW w:type="dxa" w:w="4762"/>
           </w:tcPr>
           <w:p>
             <w:r/>
@@ -2644,7 +1171,7 @@
                 <w:rFonts w:ascii="Calibri" w:hAnsi="Calibri" w:eastAsia="宋体"/>
                 <w:sz w:val="20"/>
               </w:rPr>
-              <w:t>泵出口侧边界</w:t>
+              <w:t>泵出口侧压力</w:t>
             </w:r>
           </w:p>
         </w:tc>
@@ -2667,7 +1194,7 @@
         </w:tc>
         <w:tc>
           <w:tcPr>
-            <w:tcW w:type="dxa" w:w="2835"/>
+            <w:tcW w:type="dxa" w:w="2948"/>
           </w:tcPr>
           <w:p>
             <w:r/>
@@ -2676,13 +1203,13 @@
                 <w:rFonts w:ascii="Calibri" w:hAnsi="Calibri" w:eastAsia="宋体"/>
                 <w:sz w:val="20"/>
               </w:rPr>
-              <w:t>泵吸入口压力或动液面</w:t>
+              <w:t>泵吸入口压力，或动液面</w:t>
             </w:r>
           </w:p>
         </w:tc>
         <w:tc>
           <w:tcPr>
-            <w:tcW w:type="dxa" w:w="4876"/>
+            <w:tcW w:type="dxa" w:w="4762"/>
           </w:tcPr>
           <w:p>
             <w:r/>
@@ -2691,7 +1218,7 @@
                 <w:rFonts w:ascii="Calibri" w:hAnsi="Calibri" w:eastAsia="宋体"/>
                 <w:sz w:val="20"/>
               </w:rPr>
-              <w:t>与出口侧共同定 ΔP</w:t>
+              <w:t>与出口侧一起定泵压差</w:t>
             </w:r>
           </w:p>
         </w:tc>
@@ -2714,7 +1241,7 @@
         </w:tc>
         <w:tc>
           <w:tcPr>
-            <w:tcW w:type="dxa" w:w="2835"/>
+            <w:tcW w:type="dxa" w:w="2948"/>
           </w:tcPr>
           <w:p>
             <w:r/>
@@ -2729,7 +1256,7 @@
         </w:tc>
         <w:tc>
           <w:tcPr>
-            <w:tcW w:type="dxa" w:w="4876"/>
+            <w:tcW w:type="dxa" w:w="4762"/>
           </w:tcPr>
           <w:p>
             <w:r/>
@@ -2755,13 +1282,13 @@
                 <w:rFonts w:ascii="Calibri" w:hAnsi="Calibri" w:eastAsia="宋体"/>
                 <w:sz w:val="20"/>
               </w:rPr>
-              <w:t>可选</w:t>
+              <w:t>不要用</w:t>
             </w:r>
           </w:p>
         </w:tc>
         <w:tc>
           <w:tcPr>
-            <w:tcW w:type="dxa" w:w="2835"/>
+            <w:tcW w:type="dxa" w:w="2948"/>
           </w:tcPr>
           <w:p>
             <w:r/>
@@ -2770,13 +1297,13 @@
                 <w:rFonts w:ascii="Calibri" w:hAnsi="Calibri" w:eastAsia="宋体"/>
                 <w:sz w:val="20"/>
               </w:rPr>
-              <w:t>泵累计运行时长</w:t>
+              <w:t>油嘴开度</w:t>
             </w:r>
           </w:p>
         </w:tc>
         <w:tc>
           <w:tcPr>
-            <w:tcW w:type="dxa" w:w="4876"/>
+            <w:tcW w:type="dxa" w:w="4762"/>
           </w:tcPr>
           <w:p>
             <w:r/>
@@ -2785,13 +1312,41 @@
                 <w:rFonts w:ascii="Calibri" w:hAnsi="Calibri" w:eastAsia="宋体"/>
                 <w:sz w:val="20"/>
               </w:rPr>
-              <w:t>定子磨损漂移</w:t>
+              <w:t>螺杆泵井通常没有可调油嘴，原模型里有则删掉</w:t>
             </w:r>
           </w:p>
         </w:tc>
       </w:tr>
     </w:tbl>
     <w:p/>
+    <w:p>
+      <w:pPr>
+        <w:pStyle w:val="Heading2"/>
+      </w:pPr>
+      <w:r>
+        <w:rPr>
+          <w:rFonts w:ascii="Calibri" w:hAnsi="Calibri" w:eastAsia="黑体"/>
+          <w:b/>
+          <w:color w:val="1F4E79"/>
+          <w:sz w:val="26"/>
+        </w:rPr>
+        <w:t>3.3 两种迁移结构（选一种）</w:t>
+      </w:r>
+    </w:p>
+    <w:p>
+      <w:pPr>
+        <w:spacing w:after="120"/>
+        <w:ind w:firstLine="420"/>
+      </w:pPr>
+      <w:r>
+        <w:rPr>
+          <w:rFonts w:ascii="Calibri" w:hAnsi="Calibri" w:eastAsia="宋体"/>
+          <w:b/>
+          <w:sz w:val="21"/>
+        </w:rPr>
+        <w:t>结构 A —— 直接换特征（最快）</w:t>
+      </w:r>
+    </w:p>
     <w:p>
       <w:pPr>
         <w:spacing w:after="120"/>
@@ -2803,7 +1358,35 @@
           <w:b w:val="0"/>
           <w:sz w:val="21"/>
         </w:rPr>
-        <w:t>标签：试井油/液产量，或翻斗/质量流量计连续计量。样本须覆盖多转速、多回压，否则外推失败。</w:t>
+        <w:t>打开 LSTM-for-Production 的 Notebook，把特征列改成上面的泵特征，标签改成试井产量，按时间切分训练/测试，重新 fit。适合先跑通、看效果。</w:t>
+      </w:r>
+    </w:p>
+    <w:p>
+      <w:pPr>
+        <w:spacing w:after="120"/>
+        <w:ind w:firstLine="420"/>
+      </w:pPr>
+      <w:r>
+        <w:rPr>
+          <w:rFonts w:ascii="Calibri" w:hAnsi="Calibri" w:eastAsia="宋体"/>
+          <w:b/>
+          <w:sz w:val="21"/>
+        </w:rPr>
+        <w:t>结构 B —— 机理 + 网络（更稳，推荐）</w:t>
+      </w:r>
+    </w:p>
+    <w:p>
+      <w:pPr>
+        <w:spacing w:after="120"/>
+        <w:ind w:firstLine="420"/>
+      </w:pPr>
+      <w:r>
+        <w:rPr>
+          <w:rFonts w:ascii="Calibri" w:hAnsi="Calibri" w:eastAsia="宋体"/>
+          <w:b w:val="0"/>
+          <w:sz w:val="21"/>
+        </w:rPr>
+        <w:t>产量 = 理论排量 − 滑脱量。理论排量用公式算死：Q理论 = C × 转速（C 由泵几何决定）；只让神经网络预测滑脱量（输入仍是转速、扭矩/电流、压差或压温沉没度等）。最终产量 = Q理论 − 网络输出。调转速时外推比纯黑盒稳。若用 HVFM，可把其「机理模块」换成这个泵公式。</w:t>
       </w:r>
     </w:p>
     <w:p>
@@ -2817,7 +1400,192 @@
           <w:color w:val="1F4E79"/>
           <w:sz w:val="26"/>
         </w:rPr>
-        <w:t>4.2 两种结构</w:t>
+        <w:t>3.4 具体操作清单（建议从第 1 项开源改起）</w:t>
+      </w:r>
+    </w:p>
+    <w:p>
+      <w:pPr>
+        <w:pStyle w:val="ListBullet"/>
+        <w:spacing w:after="60"/>
+      </w:pPr>
+      <w:r>
+        <w:rPr>
+          <w:rFonts w:ascii="Calibri" w:hAnsi="Calibri" w:eastAsia="宋体"/>
+          <w:b/>
+          <w:sz w:val="21"/>
+        </w:rPr>
+        <w:t>第 1 步：跑通原项目。</w:t>
+      </w:r>
+      <w:r>
+        <w:rPr>
+          <w:rFonts w:ascii="Calibri" w:hAnsi="Calibri" w:eastAsia="宋体"/>
+          <w:sz w:val="21"/>
+        </w:rPr>
+        <w:t>克隆仓库，按 README 用 Volve 示例跑通，确认环境没问题。</w:t>
+      </w:r>
+    </w:p>
+    <w:p>
+      <w:pPr>
+        <w:pStyle w:val="ListBullet"/>
+        <w:spacing w:after="60"/>
+      </w:pPr>
+      <w:r>
+        <w:rPr>
+          <w:rFonts w:ascii="Calibri" w:hAnsi="Calibri" w:eastAsia="宋体"/>
+          <w:b/>
+          <w:sz w:val="21"/>
+        </w:rPr>
+        <w:t>第 2 步：准备本井数据。</w:t>
+      </w:r>
+      <w:r>
+        <w:rPr>
+          <w:rFonts w:ascii="Calibri" w:hAnsi="Calibri" w:eastAsia="宋体"/>
+          <w:sz w:val="21"/>
+        </w:rPr>
+        <w:t>整理本井数据表：时间戳对齐的转速、扭矩/电流、井口压、沉没度、温度、含水 + 试井产量。清洗停井、缺测；按时间前后切分训练集/测试集（不要随机打乱）。</w:t>
+      </w:r>
+    </w:p>
+    <w:p>
+      <w:pPr>
+        <w:pStyle w:val="ListBullet"/>
+        <w:spacing w:after="60"/>
+      </w:pPr>
+      <w:r>
+        <w:rPr>
+          <w:rFonts w:ascii="Calibri" w:hAnsi="Calibri" w:eastAsia="宋体"/>
+          <w:b/>
+          <w:sz w:val="21"/>
+        </w:rPr>
+        <w:t>第 3 步：改输入输出。</w:t>
+      </w:r>
+      <w:r>
+        <w:rPr>
+          <w:rFonts w:ascii="Calibri" w:hAnsi="Calibri" w:eastAsia="宋体"/>
+          <w:sz w:val="21"/>
+        </w:rPr>
+        <w:t>在代码里替换特征列名与标签列；删掉油嘴相关特征；标准化方式可沿用原项目。</w:t>
+      </w:r>
+    </w:p>
+    <w:p>
+      <w:pPr>
+        <w:pStyle w:val="ListBullet"/>
+        <w:spacing w:after="60"/>
+      </w:pPr>
+      <w:r>
+        <w:rPr>
+          <w:rFonts w:ascii="Calibri" w:hAnsi="Calibri" w:eastAsia="宋体"/>
+          <w:b/>
+          <w:sz w:val="21"/>
+        </w:rPr>
+        <w:t>第 4 步：训练。</w:t>
+      </w:r>
+      <w:r>
+        <w:rPr>
+          <w:rFonts w:ascii="Calibri" w:hAnsi="Calibri" w:eastAsia="宋体"/>
+          <w:sz w:val="21"/>
+        </w:rPr>
+        <w:t>先训练结构 A；有余力再做结构 B（先算 Q理论，标签改为 试井产量−Q理论 即滑脱）。</w:t>
+      </w:r>
+    </w:p>
+    <w:p>
+      <w:pPr>
+        <w:pStyle w:val="ListBullet"/>
+        <w:spacing w:after="60"/>
+      </w:pPr>
+      <w:r>
+        <w:rPr>
+          <w:rFonts w:ascii="Calibri" w:hAnsi="Calibri" w:eastAsia="宋体"/>
+          <w:b/>
+          <w:sz w:val="21"/>
+        </w:rPr>
+        <w:t>第 5 步：验证与维护。</w:t>
+      </w:r>
+      <w:r>
+        <w:rPr>
+          <w:rFonts w:ascii="Calibri" w:hAnsi="Calibri" w:eastAsia="宋体"/>
+          <w:sz w:val="21"/>
+        </w:rPr>
+        <w:t>用后期试井盲测；重点看「调转速、调回压」后误差是否可接受；定期用新试井点微调，抵消定子磨损。</w:t>
+      </w:r>
+    </w:p>
+    <w:p>
+      <w:pPr>
+        <w:pStyle w:val="Heading2"/>
+      </w:pPr>
+      <w:r>
+        <w:rPr>
+          <w:rFonts w:ascii="Calibri" w:hAnsi="Calibri" w:eastAsia="黑体"/>
+          <w:b/>
+          <w:color w:val="1F4E79"/>
+          <w:sz w:val="26"/>
+        </w:rPr>
+        <w:t>3.5 迁移时常见坑</w:t>
+      </w:r>
+    </w:p>
+    <w:p>
+      <w:pPr>
+        <w:pStyle w:val="ListBullet"/>
+        <w:spacing w:after="60"/>
+      </w:pPr>
+      <w:r>
+        <w:rPr>
+          <w:rFonts w:ascii="Calibri" w:hAnsi="Calibri" w:eastAsia="宋体"/>
+          <w:sz w:val="21"/>
+        </w:rPr>
+        <w:t>样本太少或只覆盖一个转速档 → 换转速就失效。尽量收集多转速、多回压试井点。</w:t>
+      </w:r>
+    </w:p>
+    <w:p>
+      <w:pPr>
+        <w:pStyle w:val="ListBullet"/>
+        <w:spacing w:after="60"/>
+      </w:pPr>
+      <w:r>
+        <w:rPr>
+          <w:rFonts w:ascii="Calibri" w:hAnsi="Calibri" w:eastAsia="宋体"/>
+          <w:sz w:val="21"/>
+        </w:rPr>
+        <w:t>随机划分训练/测试 → 时间泄漏，指标虚高。必须按时间切分。</w:t>
+      </w:r>
+    </w:p>
+    <w:p>
+      <w:pPr>
+        <w:pStyle w:val="ListBullet"/>
+        <w:spacing w:after="60"/>
+      </w:pPr>
+      <w:r>
+        <w:rPr>
+          <w:rFonts w:ascii="Calibri" w:hAnsi="Calibri" w:eastAsia="宋体"/>
+          <w:sz w:val="21"/>
+        </w:rPr>
+        <w:t>把「产量预测」（用历史产量猜未来）当成计产 → 问题都答错了。计产输入必须是当前工况。</w:t>
+      </w:r>
+    </w:p>
+    <w:p>
+      <w:pPr>
+        <w:pStyle w:val="ListBullet"/>
+        <w:spacing w:after="60"/>
+      </w:pPr>
+      <w:r>
+        <w:rPr>
+          <w:rFonts w:ascii="Calibri" w:hAnsi="Calibri" w:eastAsia="宋体"/>
+          <w:sz w:val="21"/>
+        </w:rPr>
+        <w:t>没有公开螺杆泵井数据集，不能指望下载现成权重；必须用自有井数据训练。</w:t>
+      </w:r>
+    </w:p>
+    <w:p>
+      <w:pPr>
+        <w:pStyle w:val="Heading1"/>
+      </w:pPr>
+      <w:r>
+        <w:rPr>
+          <w:rFonts w:ascii="Calibri" w:hAnsi="Calibri" w:eastAsia="黑体"/>
+          <w:b/>
+          <w:color w:val="1F4E79"/>
+          <w:sz w:val="32"/>
+        </w:rPr>
+        <w:t>四、辅助工具（算泵压差时用，不是 NN 本身）</w:t>
       </w:r>
     </w:p>
     <w:p>
@@ -2831,91 +1599,171 @@
           <w:b w:val="0"/>
           <w:sz w:val="21"/>
         </w:rPr>
-        <w:t>结构 A（纯数据驱动）：特征 → MLP/LSTM/TCN → 产量。实现快，极端工况可能不合理。</w:t>
+        <w:t>迁移神经网络时，若没有吸入口压力传感器，可用井筒模型从井口压力反算泵压差，作为网络的一个输入特征（或用于结构 B）。</w:t>
       </w:r>
     </w:p>
-    <w:p>
-      <w:pPr>
-        <w:spacing w:after="120"/>
-        <w:ind w:firstLine="420"/>
-      </w:pPr>
-      <w:r>
-        <w:rPr>
-          <w:rFonts w:ascii="Calibri" w:hAnsi="Calibri" w:eastAsia="宋体"/>
-          <w:b w:val="0"/>
-          <w:sz w:val="21"/>
-        </w:rPr>
-        <w:t>结构 B（推荐，机理+NN）：Q = C×转速 − NN(转速, 扭矩/电流, ΔP或压温沉没度, …)。ΔP 可用第三章井筒模型算，或用吸入口压力传感器。理论排量物理正确，网络只学滑脱，调转速时更稳。</w:t>
-      </w:r>
-    </w:p>
-    <w:p>
-      <w:pPr>
-        <w:pStyle w:val="Heading2"/>
-      </w:pPr>
-      <w:r>
-        <w:rPr>
-          <w:rFonts w:ascii="Calibri" w:hAnsi="Calibri" w:eastAsia="黑体"/>
-          <w:b/>
-          <w:color w:val="1F4E79"/>
-          <w:sz w:val="26"/>
-        </w:rPr>
-        <w:t>4.3 推荐改造步骤</w:t>
-      </w:r>
-    </w:p>
-    <w:p>
-      <w:pPr>
-        <w:spacing w:after="120"/>
-        <w:ind w:firstLine="420"/>
-      </w:pPr>
-      <w:r>
-        <w:rPr>
-          <w:rFonts w:ascii="Calibri" w:hAnsi="Calibri" w:eastAsia="宋体"/>
-          <w:b w:val="0"/>
-          <w:sz w:val="21"/>
-        </w:rPr>
-        <w:t>① 克隆 LSTM-for-Production，跑通 Volve 示例弄清管线。② 换成自有数据表，特征按 4.1，标签用试井产量；按时间切分训练/测试。③ 先 XGBoost 基线，再 LSTM/MLP；有条件上结构 B。④ 需要更强时序时，把网络换成 HVFM 的 TCN。⑤ 用后期试井盲测；关注调转速前后是否跟得上；按季度用新试井微调防磨损漂移。</w:t>
-      </w:r>
-    </w:p>
-    <w:p>
-      <w:pPr>
-        <w:pStyle w:val="Heading2"/>
-      </w:pPr>
-      <w:r>
-        <w:rPr>
-          <w:rFonts w:ascii="Calibri" w:hAnsi="Calibri" w:eastAsia="黑体"/>
-          <w:b/>
-          <w:color w:val="1F4E79"/>
-          <w:sz w:val="26"/>
-        </w:rPr>
-        <w:t>4.4 可参考但非开源代码的论文</w:t>
-      </w:r>
-    </w:p>
-    <w:p>
-      <w:pPr>
-        <w:pStyle w:val="ListBullet"/>
-        <w:spacing w:after="80"/>
-      </w:pPr>
-      <w:r>
-        <w:rPr>
-          <w:rFonts w:ascii="Calibri" w:hAnsi="Calibri" w:eastAsia="宋体"/>
-          <w:sz w:val="21"/>
-        </w:rPr>
-        <w:t>ESP 井 LSTM 流量估计（Energies 2025）：输入功率、频率、压力，与螺杆泵井输入同构；</w:t>
-      </w:r>
-    </w:p>
-    <w:p>
-      <w:pPr>
-        <w:pStyle w:val="ListBullet"/>
-        <w:spacing w:after="80"/>
-      </w:pPr>
-      <w:r>
-        <w:rPr>
-          <w:rFonts w:ascii="Calibri" w:hAnsi="Calibri" w:eastAsia="宋体"/>
-          <w:sz w:val="21"/>
-        </w:rPr>
-        <w:t>NTNU 贝叶斯 NN VFM、Bikmukhametov 博士论文、WISE 基础模型：方法可借鉴，无 PCP 专用开源。</w:t>
-      </w:r>
-    </w:p>
+    <w:tbl>
+      <w:tblPr>
+        <w:tblStyle w:val="LightGrid-Accent1"/>
+        <w:tblW w:type="auto" w:w="0"/>
+        <w:jc w:val="center"/>
+        <w:tblLook w:firstColumn="1" w:firstRow="1" w:lastColumn="0" w:lastRow="0" w:noHBand="0" w:noVBand="1" w:val="04A0"/>
+      </w:tblPr>
+      <w:tblGrid>
+        <w:gridCol w:w="2882"/>
+        <w:gridCol w:w="2882"/>
+        <w:gridCol w:w="2882"/>
+      </w:tblGrid>
+      <w:tr>
+        <w:tc>
+          <w:tcPr>
+            <w:tcW w:type="dxa" w:w="2268"/>
+          </w:tcPr>
+          <w:p>
+            <w:r/>
+            <w:r>
+              <w:rPr>
+                <w:rFonts w:ascii="Calibri" w:hAnsi="Calibri" w:eastAsia="黑体"/>
+                <w:b/>
+                <w:sz w:val="21"/>
+              </w:rPr>
+              <w:t>用途</w:t>
+            </w:r>
+          </w:p>
+        </w:tc>
+        <w:tc>
+          <w:tcPr>
+            <w:tcW w:type="dxa" w:w="3685"/>
+          </w:tcPr>
+          <w:p>
+            <w:r/>
+            <w:r>
+              <w:rPr>
+                <w:rFonts w:ascii="Calibri" w:hAnsi="Calibri" w:eastAsia="黑体"/>
+                <w:b/>
+                <w:sz w:val="21"/>
+              </w:rPr>
+              <w:t>开源工具</w:t>
+            </w:r>
+          </w:p>
+        </w:tc>
+        <w:tc>
+          <w:tcPr>
+            <w:tcW w:type="dxa" w:w="3118"/>
+          </w:tcPr>
+          <w:p>
+            <w:r/>
+            <w:r>
+              <w:rPr>
+                <w:rFonts w:ascii="Calibri" w:hAnsi="Calibri" w:eastAsia="黑体"/>
+                <w:b/>
+                <w:sz w:val="21"/>
+              </w:rPr>
+              <w:t>地址</w:t>
+            </w:r>
+          </w:p>
+        </w:tc>
+      </w:tr>
+      <w:tr>
+        <w:tc>
+          <w:tcPr>
+            <w:tcW w:type="dxa" w:w="2268"/>
+          </w:tcPr>
+          <w:p>
+            <w:r/>
+            <w:r>
+              <w:rPr>
+                <w:rFonts w:ascii="Calibri" w:hAnsi="Calibri" w:eastAsia="宋体"/>
+                <w:sz w:val="20"/>
+              </w:rPr>
+              <w:t>井筒压降 / 运移（算泵出口压力）</w:t>
+            </w:r>
+          </w:p>
+        </w:tc>
+        <w:tc>
+          <w:tcPr>
+            <w:tcW w:type="dxa" w:w="3685"/>
+          </w:tcPr>
+          <w:p>
+            <w:r/>
+            <w:r>
+              <w:rPr>
+                <w:rFonts w:ascii="Calibri" w:hAnsi="Calibri" w:eastAsia="宋体"/>
+                <w:sz w:val="20"/>
+              </w:rPr>
+              <w:t>flotech（关联式，上手快）、marlim3（瞬态）、ManyWells（稳态漂移流）</w:t>
+            </w:r>
+          </w:p>
+        </w:tc>
+        <w:tc>
+          <w:tcPr>
+            <w:tcW w:type="dxa" w:w="3118"/>
+          </w:tcPr>
+          <w:p>
+            <w:r/>
+            <w:r>
+              <w:rPr>
+                <w:rFonts w:ascii="Calibri" w:hAnsi="Calibri" w:eastAsia="宋体"/>
+                <w:sz w:val="20"/>
+              </w:rPr>
+              <w:t>pip install flotech</w:t>
+              <w:br/>
+              <w:t>github.com/petrobras/marlim3</w:t>
+              <w:br/>
+              <w:t>github.com/solution-seeker-as/manywells</w:t>
+            </w:r>
+          </w:p>
+        </w:tc>
+      </w:tr>
+      <w:tr>
+        <w:tc>
+          <w:tcPr>
+            <w:tcW w:type="dxa" w:w="2268"/>
+          </w:tcPr>
+          <w:p>
+            <w:r/>
+            <w:r>
+              <w:rPr>
+                <w:rFonts w:ascii="Calibri" w:hAnsi="Calibri" w:eastAsia="宋体"/>
+                <w:sz w:val="20"/>
+              </w:rPr>
+              <w:t>泵理论排量与滑脱（结构 B）</w:t>
+            </w:r>
+          </w:p>
+        </w:tc>
+        <w:tc>
+          <w:tcPr>
+            <w:tcW w:type="dxa" w:w="3685"/>
+          </w:tcPr>
+          <w:p>
+            <w:r/>
+            <w:r>
+              <w:rPr>
+                <w:rFonts w:ascii="Calibri" w:hAnsi="Calibri" w:eastAsia="宋体"/>
+                <w:sz w:val="20"/>
+              </w:rPr>
+              <w:t>无开成品库；按论文自写：Q理论=C×n，滑脱用 Gamboa/COBEM2009 或 2018 金属定子模型</w:t>
+            </w:r>
+          </w:p>
+        </w:tc>
+        <w:tc>
+          <w:tcPr>
+            <w:tcW w:type="dxa" w:w="3118"/>
+          </w:tcPr>
+          <w:p>
+            <w:r/>
+            <w:r>
+              <w:rPr>
+                <w:rFonts w:ascii="Calibri" w:hAnsi="Calibri" w:eastAsia="宋体"/>
+                <w:sz w:val="20"/>
+              </w:rPr>
+              <w:t>论文 DOI:10.1155/2018/3696930 等</w:t>
+            </w:r>
+          </w:p>
+        </w:tc>
+      </w:tr>
+    </w:tbl>
+    <w:p/>
     <w:p>
       <w:pPr>
         <w:pStyle w:val="Heading1"/>
@@ -2927,43 +1775,70 @@
           <w:color w:val="1F4E79"/>
           <w:sz w:val="32"/>
         </w:rPr>
-        <w:t>五、选型清单（针对你的螺杆泵井）</w:t>
+        <w:t>五、你现在该做什么</w:t>
       </w:r>
     </w:p>
     <w:p>
       <w:pPr>
-        <w:spacing w:after="160"/>
+        <w:pStyle w:val="ListBullet"/>
+        <w:spacing w:after="60"/>
       </w:pPr>
       <w:r>
         <w:rPr>
-          <w:rFonts w:ascii="Calibri" w:hAnsi="Calibri" w:eastAsia="黑体"/>
+          <w:rFonts w:ascii="Calibri" w:hAnsi="Calibri" w:eastAsia="宋体"/>
           <w:b/>
-          <w:color w:val="1F4E79"/>
           <w:sz w:val="21"/>
         </w:rPr>
-        <w:t>【本章概述】</w:t>
+        <w:t>今天：</w:t>
       </w:r>
       <w:r>
         <w:rPr>
           <w:rFonts w:ascii="Calibri" w:hAnsi="Calibri" w:eastAsia="宋体"/>
           <w:sz w:val="21"/>
         </w:rPr>
-        <w:t>一页纸结论：要什么、不要指望什么、立刻做什么。</w:t>
+        <w:t>打开 LSTM-for-Production，跑通示例。</w:t>
       </w:r>
     </w:p>
     <w:p>
       <w:pPr>
-        <w:spacing w:after="120"/>
-        <w:ind w:firstLine="420"/>
+        <w:pStyle w:val="ListBullet"/>
+        <w:spacing w:after="60"/>
       </w:pPr>
       <w:r>
         <w:rPr>
           <w:rFonts w:ascii="Calibri" w:hAnsi="Calibri" w:eastAsia="宋体"/>
           <w:b/>
-          <w:color w:val="C0392B"/>
           <w:sz w:val="21"/>
         </w:rPr>
-        <w:t>要找的「开源螺杆泵井神经网络计产成品」：目前没有。</w:t>
+        <w:t>本周：</w:t>
+      </w:r>
+      <w:r>
+        <w:rPr>
+          <w:rFonts w:ascii="Calibri" w:hAnsi="Calibri" w:eastAsia="宋体"/>
+          <w:sz w:val="21"/>
+        </w:rPr>
+        <w:t>导出本井「泵参数 + 试井产量」对齐表，按 3.2 列好特征。</w:t>
+      </w:r>
+    </w:p>
+    <w:p>
+      <w:pPr>
+        <w:pStyle w:val="ListBullet"/>
+        <w:spacing w:after="60"/>
+      </w:pPr>
+      <w:r>
+        <w:rPr>
+          <w:rFonts w:ascii="Calibri" w:hAnsi="Calibri" w:eastAsia="宋体"/>
+          <w:b/>
+          <w:sz w:val="21"/>
+        </w:rPr>
+        <w:t>下一步：</w:t>
+      </w:r>
+      <w:r>
+        <w:rPr>
+          <w:rFonts w:ascii="Calibri" w:hAnsi="Calibri" w:eastAsia="宋体"/>
+          <w:sz w:val="21"/>
+        </w:rPr>
+        <w:t>完成结构 A 训练与盲测；误差可接受再上结构 B。</w:t>
       </w:r>
     </w:p>
     <w:p>
@@ -2977,73 +1852,7 @@
           <w:b/>
           <w:sz w:val="21"/>
         </w:rPr>
-        <w:t>立刻可做：</w:t>
-      </w:r>
-    </w:p>
-    <w:p>
-      <w:pPr>
-        <w:pStyle w:val="ListBullet"/>
-        <w:spacing w:after="80"/>
-      </w:pPr>
-      <w:r>
-        <w:rPr>
-          <w:rFonts w:ascii="Calibri" w:hAnsi="Calibri" w:eastAsia="宋体"/>
-          <w:sz w:val="21"/>
-        </w:rPr>
-        <w:t>计产 NN 代码骨架：改 LSTM-for-Production / HVFM（第一章表）；</w:t>
-      </w:r>
-    </w:p>
-    <w:p>
-      <w:pPr>
-        <w:pStyle w:val="ListBullet"/>
-        <w:spacing w:after="80"/>
-      </w:pPr>
-      <w:r>
-        <w:rPr>
-          <w:rFonts w:ascii="Calibri" w:hAnsi="Calibri" w:eastAsia="宋体"/>
-          <w:sz w:val="21"/>
-        </w:rPr>
-        <w:t>泵压差特征：flotech 或 marlim3（第三章）；</w:t>
-      </w:r>
-    </w:p>
-    <w:p>
-      <w:pPr>
-        <w:pStyle w:val="ListBullet"/>
-        <w:spacing w:after="80"/>
-      </w:pPr>
-      <w:r>
-        <w:rPr>
-          <w:rFonts w:ascii="Calibri" w:hAnsi="Calibri" w:eastAsia="宋体"/>
-          <w:sz w:val="21"/>
-        </w:rPr>
-        <w:t>泵理论排量与滑脱：自写解析式 + 试井标定（第三章 3.3）；</w:t>
-      </w:r>
-    </w:p>
-    <w:p>
-      <w:pPr>
-        <w:pStyle w:val="ListBullet"/>
-        <w:spacing w:after="80"/>
-      </w:pPr>
-      <w:r>
-        <w:rPr>
-          <w:rFonts w:ascii="Calibri" w:hAnsi="Calibri" w:eastAsia="宋体"/>
-          <w:sz w:val="21"/>
-        </w:rPr>
-        <w:t>训练数据：必须用本油田螺杆泵井试井与泵运行数据（无公开同类数据集）。</w:t>
-      </w:r>
-    </w:p>
-    <w:p>
-      <w:pPr>
-        <w:spacing w:after="120"/>
-        <w:ind w:firstLine="420"/>
-      </w:pPr>
-      <w:r>
-        <w:rPr>
-          <w:rFonts w:ascii="Calibri" w:hAnsi="Calibri" w:eastAsia="宋体"/>
-          <w:b w:val="0"/>
-          <w:sz w:val="21"/>
-        </w:rPr>
-        <w:t>不要做：把油嘴计产 NN 或「历史产量时序预测」项目直接当螺杆泵井计产用。</w:t>
+        <w:t>一句话回顾：没有螺杆泵专用开源计产 NN → 用通用 VFM 开源（首选 LSTM-for-Production）→ 特征换成泵工况、标签用试井产量重新训练 → 有条件做成「理论排量 − 网络滑脱」。</w:t>
       </w:r>
     </w:p>
     <w:sectPr>

</xml_diff>

<commit_message>
Append PCP-related non-metering open source (fault diagnosis etc.) as final chapter
Co-authored-by: whitegod123 <whitegod123@users.noreply.github.com>
</commit_message>
<xml_diff>
--- a/开源螺杆泵井神经网络计产模型调研报告.docx
+++ b/开源螺杆泵井神经网络计产模型调研报告.docx
@@ -1855,6 +1855,439 @@
         <w:t>一句话回顾：没有螺杆泵专用开源计产 NN → 用通用 VFM 开源（首选 LSTM-for-Production）→ 特征换成泵工况、标签用试井产量重新训练 → 有条件做成「理论排量 − 网络滑脱」。</w:t>
       </w:r>
     </w:p>
+    <w:p>
+      <w:pPr>
+        <w:pStyle w:val="Heading1"/>
+      </w:pPr>
+      <w:r>
+        <w:rPr>
+          <w:rFonts w:ascii="Calibri" w:hAnsi="Calibri" w:eastAsia="黑体"/>
+          <w:b/>
+          <w:color w:val="1F4E79"/>
+          <w:sz w:val="32"/>
+        </w:rPr>
+        <w:t>六、附录：螺杆泵相关开源（非计产，勿与第二章混淆）</w:t>
+      </w:r>
+    </w:p>
+    <w:p>
+      <w:pPr>
+        <w:spacing w:after="120"/>
+        <w:ind w:firstLine="420"/>
+      </w:pPr>
+      <w:r>
+        <w:rPr>
+          <w:rFonts w:ascii="Calibri" w:hAnsi="Calibri" w:eastAsia="宋体"/>
+          <w:b w:val="0"/>
+          <w:sz w:val="21"/>
+        </w:rPr>
+        <w:t>检索时还会碰到一批名字带「螺杆泵 / PCP」的开源仓库。它们做的是故障诊断、几何设计、资产管理等，不是「工况→产量」的神经网络计产。列在此处以免遗漏，也避免误当成计产模型使用。</w:t>
+      </w:r>
+    </w:p>
+    <w:tbl>
+      <w:tblPr>
+        <w:tblStyle w:val="LightGrid-Accent1"/>
+        <w:tblW w:type="auto" w:w="0"/>
+        <w:jc w:val="center"/>
+        <w:tblLook w:firstColumn="1" w:firstRow="1" w:lastColumn="0" w:lastRow="0" w:noHBand="0" w:noVBand="1" w:val="04A0"/>
+      </w:tblPr>
+      <w:tblGrid>
+        <w:gridCol w:w="2161"/>
+        <w:gridCol w:w="2161"/>
+        <w:gridCol w:w="2161"/>
+        <w:gridCol w:w="2161"/>
+      </w:tblGrid>
+      <w:tr>
+        <w:tc>
+          <w:tcPr>
+            <w:tcW w:type="dxa" w:w="2154"/>
+          </w:tcPr>
+          <w:p>
+            <w:r/>
+            <w:r>
+              <w:rPr>
+                <w:rFonts w:ascii="Calibri" w:hAnsi="Calibri" w:eastAsia="黑体"/>
+                <w:b/>
+                <w:sz w:val="21"/>
+              </w:rPr>
+              <w:t>项目</w:t>
+            </w:r>
+          </w:p>
+        </w:tc>
+        <w:tc>
+          <w:tcPr>
+            <w:tcW w:type="dxa" w:w="2721"/>
+          </w:tcPr>
+          <w:p>
+            <w:r/>
+            <w:r>
+              <w:rPr>
+                <w:rFonts w:ascii="Calibri" w:hAnsi="Calibri" w:eastAsia="黑体"/>
+                <w:b/>
+                <w:sz w:val="21"/>
+              </w:rPr>
+              <w:t>地址</w:t>
+            </w:r>
+          </w:p>
+        </w:tc>
+        <w:tc>
+          <w:tcPr>
+            <w:tcW w:type="dxa" w:w="2835"/>
+          </w:tcPr>
+          <w:p>
+            <w:r/>
+            <w:r>
+              <w:rPr>
+                <w:rFonts w:ascii="Calibri" w:hAnsi="Calibri" w:eastAsia="黑体"/>
+                <w:b/>
+                <w:sz w:val="21"/>
+              </w:rPr>
+              <w:t>实际做什么</w:t>
+            </w:r>
+          </w:p>
+        </w:tc>
+        <w:tc>
+          <w:tcPr>
+            <w:tcW w:type="dxa" w:w="1361"/>
+          </w:tcPr>
+          <w:p>
+            <w:r/>
+            <w:r>
+              <w:rPr>
+                <w:rFonts w:ascii="Calibri" w:hAnsi="Calibri" w:eastAsia="黑体"/>
+                <w:b/>
+                <w:sz w:val="21"/>
+              </w:rPr>
+              <w:t>能否当计产用</w:t>
+            </w:r>
+          </w:p>
+        </w:tc>
+      </w:tr>
+      <w:tr>
+        <w:tc>
+          <w:tcPr>
+            <w:tcW w:type="dxa" w:w="2154"/>
+          </w:tcPr>
+          <w:p>
+            <w:r/>
+            <w:r>
+              <w:rPr>
+                <w:rFonts w:ascii="Calibri" w:hAnsi="Calibri" w:eastAsia="宋体"/>
+                <w:sz w:val="20"/>
+              </w:rPr>
+              <w:t>pump_ai_software（螺杆泵AI软件）</w:t>
+            </w:r>
+          </w:p>
+        </w:tc>
+        <w:tc>
+          <w:tcPr>
+            <w:tcW w:type="dxa" w:w="2721"/>
+          </w:tcPr>
+          <w:p>
+            <w:r/>
+            <w:r>
+              <w:rPr>
+                <w:rFonts w:ascii="Calibri" w:hAnsi="Calibri" w:eastAsia="宋体"/>
+                <w:sz w:val="20"/>
+              </w:rPr>
+              <w:t>github.com/xiansurfer/pump_ai_software</w:t>
+            </w:r>
+          </w:p>
+        </w:tc>
+        <w:tc>
+          <w:tcPr>
+            <w:tcW w:type="dxa" w:w="2835"/>
+          </w:tcPr>
+          <w:p>
+            <w:r/>
+            <w:r>
+              <w:rPr>
+                <w:rFonts w:ascii="Calibri" w:hAnsi="Calibri" w:eastAsia="宋体"/>
+                <w:sz w:val="20"/>
+              </w:rPr>
+              <w:t>宏观控制图（扭矩/泵效）、故障预警、生存分析；国内油田泵故障数据</w:t>
+            </w:r>
+          </w:p>
+        </w:tc>
+        <w:tc>
+          <w:tcPr>
+            <w:tcW w:type="dxa" w:w="1361"/>
+          </w:tcPr>
+          <w:p>
+            <w:r/>
+            <w:r>
+              <w:rPr>
+                <w:rFonts w:ascii="Calibri" w:hAnsi="Calibri" w:eastAsia="宋体"/>
+                <w:sz w:val="20"/>
+              </w:rPr>
+              <w:t>否（故障诊断）</w:t>
+            </w:r>
+          </w:p>
+        </w:tc>
+      </w:tr>
+      <w:tr>
+        <w:tc>
+          <w:tcPr>
+            <w:tcW w:type="dxa" w:w="2154"/>
+          </w:tcPr>
+          <w:p>
+            <w:r/>
+            <w:r>
+              <w:rPr>
+                <w:rFonts w:ascii="Calibri" w:hAnsi="Calibri" w:eastAsia="宋体"/>
+                <w:sz w:val="20"/>
+              </w:rPr>
+              <w:t>ScrewPumpCalculator</w:t>
+            </w:r>
+          </w:p>
+        </w:tc>
+        <w:tc>
+          <w:tcPr>
+            <w:tcW w:type="dxa" w:w="2721"/>
+          </w:tcPr>
+          <w:p>
+            <w:r/>
+            <w:r>
+              <w:rPr>
+                <w:rFonts w:ascii="Calibri" w:hAnsi="Calibri" w:eastAsia="宋体"/>
+                <w:sz w:val="20"/>
+              </w:rPr>
+              <w:t>github.com/aiguoli/ScrewPumpCalculator</w:t>
+            </w:r>
+          </w:p>
+        </w:tc>
+        <w:tc>
+          <w:tcPr>
+            <w:tcW w:type="dxa" w:w="2835"/>
+          </w:tcPr>
+          <w:p>
+            <w:r/>
+            <w:r>
+              <w:rPr>
+                <w:rFonts w:ascii="Calibri" w:hAnsi="Calibri" w:eastAsia="宋体"/>
+                <w:sz w:val="20"/>
+              </w:rPr>
+              <w:t>螺杆泵参数计算与型线设计（SolidWorks 二次开发）</w:t>
+            </w:r>
+          </w:p>
+        </w:tc>
+        <w:tc>
+          <w:tcPr>
+            <w:tcW w:type="dxa" w:w="1361"/>
+          </w:tcPr>
+          <w:p>
+            <w:r/>
+            <w:r>
+              <w:rPr>
+                <w:rFonts w:ascii="Calibri" w:hAnsi="Calibri" w:eastAsia="宋体"/>
+                <w:sz w:val="20"/>
+              </w:rPr>
+              <w:t>否（几何设计）</w:t>
+            </w:r>
+          </w:p>
+        </w:tc>
+      </w:tr>
+      <w:tr>
+        <w:tc>
+          <w:tcPr>
+            <w:tcW w:type="dxa" w:w="2154"/>
+          </w:tcPr>
+          <w:p>
+            <w:r/>
+            <w:r>
+              <w:rPr>
+                <w:rFonts w:ascii="Calibri" w:hAnsi="Calibri" w:eastAsia="宋体"/>
+                <w:sz w:val="20"/>
+              </w:rPr>
+              <w:t>PCP-Tracker-Project</w:t>
+            </w:r>
+          </w:p>
+        </w:tc>
+        <w:tc>
+          <w:tcPr>
+            <w:tcW w:type="dxa" w:w="2721"/>
+          </w:tcPr>
+          <w:p>
+            <w:r/>
+            <w:r>
+              <w:rPr>
+                <w:rFonts w:ascii="Calibri" w:hAnsi="Calibri" w:eastAsia="宋体"/>
+                <w:sz w:val="20"/>
+              </w:rPr>
+              <w:t>github.com/Mabubakr86/PCP-Tracker-Project</w:t>
+            </w:r>
+          </w:p>
+        </w:tc>
+        <w:tc>
+          <w:tcPr>
+            <w:tcW w:type="dxa" w:w="2835"/>
+          </w:tcPr>
+          <w:p>
+            <w:r/>
+            <w:r>
+              <w:rPr>
+                <w:rFonts w:ascii="Calibri" w:hAnsi="Calibri" w:eastAsia="宋体"/>
+                <w:sz w:val="20"/>
+              </w:rPr>
+              <w:t>螺杆泵资产跟踪桌面应用</w:t>
+            </w:r>
+          </w:p>
+        </w:tc>
+        <w:tc>
+          <w:tcPr>
+            <w:tcW w:type="dxa" w:w="1361"/>
+          </w:tcPr>
+          <w:p>
+            <w:r/>
+            <w:r>
+              <w:rPr>
+                <w:rFonts w:ascii="Calibri" w:hAnsi="Calibri" w:eastAsia="宋体"/>
+                <w:sz w:val="20"/>
+              </w:rPr>
+              <w:t>否（资产管理）</w:t>
+            </w:r>
+          </w:p>
+        </w:tc>
+      </w:tr>
+      <w:tr>
+        <w:tc>
+          <w:tcPr>
+            <w:tcW w:type="dxa" w:w="2154"/>
+          </w:tcPr>
+          <w:p>
+            <w:r/>
+            <w:r>
+              <w:rPr>
+                <w:rFonts w:ascii="Calibri" w:hAnsi="Calibri" w:eastAsia="宋体"/>
+                <w:sz w:val="20"/>
+              </w:rPr>
+              <w:t>progressive-cavity-pump（OpenSCAD）</w:t>
+            </w:r>
+          </w:p>
+        </w:tc>
+        <w:tc>
+          <w:tcPr>
+            <w:tcW w:type="dxa" w:w="2721"/>
+          </w:tcPr>
+          <w:p>
+            <w:r/>
+            <w:r>
+              <w:rPr>
+                <w:rFonts w:ascii="Calibri" w:hAnsi="Calibri" w:eastAsia="宋体"/>
+                <w:sz w:val="20"/>
+              </w:rPr>
+              <w:t>github.com/Rmurthy1/progressive-cavity-pump</w:t>
+            </w:r>
+          </w:p>
+        </w:tc>
+        <w:tc>
+          <w:tcPr>
+            <w:tcW w:type="dxa" w:w="2835"/>
+          </w:tcPr>
+          <w:p>
+            <w:r/>
+            <w:r>
+              <w:rPr>
+                <w:rFonts w:ascii="Calibri" w:hAnsi="Calibri" w:eastAsia="宋体"/>
+                <w:sz w:val="20"/>
+              </w:rPr>
+              <w:t>泵三维几何建模</w:t>
+            </w:r>
+          </w:p>
+        </w:tc>
+        <w:tc>
+          <w:tcPr>
+            <w:tcW w:type="dxa" w:w="1361"/>
+          </w:tcPr>
+          <w:p>
+            <w:r/>
+            <w:r>
+              <w:rPr>
+                <w:rFonts w:ascii="Calibri" w:hAnsi="Calibri" w:eastAsia="宋体"/>
+                <w:sz w:val="20"/>
+              </w:rPr>
+              <w:t>否</w:t>
+            </w:r>
+          </w:p>
+        </w:tc>
+      </w:tr>
+      <w:tr>
+        <w:tc>
+          <w:tcPr>
+            <w:tcW w:type="dxa" w:w="2154"/>
+          </w:tcPr>
+          <w:p>
+            <w:r/>
+            <w:r>
+              <w:rPr>
+                <w:rFonts w:ascii="Calibri" w:hAnsi="Calibri" w:eastAsia="宋体"/>
+                <w:sz w:val="20"/>
+              </w:rPr>
+              <w:t>accapumps/progressive-cavity-pumps</w:t>
+            </w:r>
+          </w:p>
+        </w:tc>
+        <w:tc>
+          <w:tcPr>
+            <w:tcW w:type="dxa" w:w="2721"/>
+          </w:tcPr>
+          <w:p>
+            <w:r/>
+            <w:r>
+              <w:rPr>
+                <w:rFonts w:ascii="Calibri" w:hAnsi="Calibri" w:eastAsia="宋体"/>
+                <w:sz w:val="20"/>
+              </w:rPr>
+              <w:t>github.com/accapumps/progressive-cavity-pumps</w:t>
+            </w:r>
+          </w:p>
+        </w:tc>
+        <w:tc>
+          <w:tcPr>
+            <w:tcW w:type="dxa" w:w="2835"/>
+          </w:tcPr>
+          <w:p>
+            <w:r/>
+            <w:r>
+              <w:rPr>
+                <w:rFonts w:ascii="Calibri" w:hAnsi="Calibri" w:eastAsia="宋体"/>
+                <w:sz w:val="20"/>
+              </w:rPr>
+              <w:t>泵研究资料仓库</w:t>
+            </w:r>
+          </w:p>
+        </w:tc>
+        <w:tc>
+          <w:tcPr>
+            <w:tcW w:type="dxa" w:w="1361"/>
+          </w:tcPr>
+          <w:p>
+            <w:r/>
+            <w:r>
+              <w:rPr>
+                <w:rFonts w:ascii="Calibri" w:hAnsi="Calibri" w:eastAsia="宋体"/>
+                <w:sz w:val="20"/>
+              </w:rPr>
+              <w:t>否</w:t>
+            </w:r>
+          </w:p>
+        </w:tc>
+      </w:tr>
+    </w:tbl>
+    <w:p/>
+    <w:p>
+      <w:pPr>
+        <w:spacing w:after="120"/>
+        <w:ind w:firstLine="420"/>
+      </w:pPr>
+      <w:r>
+        <w:rPr>
+          <w:rFonts w:ascii="Calibri" w:hAnsi="Calibri" w:eastAsia="宋体"/>
+          <w:b w:val="0"/>
+          <w:sz w:val="21"/>
+        </w:rPr>
+        <w:t>若业务同时需要「计产 + 故障诊断」，可并行使用：计产走第二章迁移路径；故障诊断可参考 pump_ai_software 的控制图与预警思路。二者输入传感器有重叠（转速、扭矩、电流），但训练标签不同（产量 vs 故障类别），不能混成一个模型。</w:t>
+      </w:r>
+    </w:p>
     <w:sectPr>
       <w:pgSz w:w="12240" w:h="15840"/>
       <w:pgMar w:top="1440" w:right="1797" w:bottom="1440" w:left="1797" w:header="720" w:footer="720" w:gutter="0"/>

</xml_diff>

<commit_message>
Restore PCP metering definition and mechanistic workflow as chapter 2
Co-authored-by: whitegod123 <whitegod123@users.noreply.github.com>
</commit_message>
<xml_diff>
--- a/开源螺杆泵井神经网络计产模型调研报告.docx
+++ b/开源螺杆泵井神经网络计产模型调研报告.docx
@@ -28,7 +28,7 @@
           <w:color w:val="666666"/>
           <w:sz w:val="24"/>
         </w:rPr>
-        <w:t>结论 → 相关开源 → 怎么迁移 → 辅助工具</w:t>
+        <w:t>结论 → 计产定义与机理流程 → 相关开源 → 怎么迁移 → 辅助工具 → 附录</w:t>
       </w:r>
     </w:p>
     <w:p>
@@ -84,7 +84,7 @@
           <w:color w:val="1F4E79"/>
           <w:sz w:val="32"/>
         </w:rPr>
-        <w:t>二、相关开源模型（按迁移优先级）</w:t>
+        <w:t>二、螺杆泵井计产定义与机理计产流程</w:t>
       </w:r>
     </w:p>
     <w:p>
@@ -98,7 +98,847 @@
           <w:b w:val="0"/>
           <w:sz w:val="21"/>
         </w:rPr>
-        <w:t>下表只列「能拿来改成螺杆泵井计产」的开源。与计产无关的（故障诊断、几何设计、资产管理）不列。</w:t>
+        <w:t>迁移神经网络之前，先弄清「计产」在螺杆泵井上是什么意思，以及机理法如何算出产量。神经网络学的就是同一条映射。</w:t>
+      </w:r>
+    </w:p>
+    <w:p>
+      <w:pPr>
+        <w:pStyle w:val="Heading2"/>
+      </w:pPr>
+      <w:r>
+        <w:rPr>
+          <w:rFonts w:ascii="Calibri" w:hAnsi="Calibri" w:eastAsia="黑体"/>
+          <w:b/>
+          <w:color w:val="1F4E79"/>
+          <w:sz w:val="26"/>
+        </w:rPr>
+        <w:t>2.1 计产是什么（与产量预测的区别）</w:t>
+      </w:r>
+    </w:p>
+    <w:tbl>
+      <w:tblPr>
+        <w:tblStyle w:val="LightGrid-Accent1"/>
+        <w:tblW w:type="auto" w:w="0"/>
+        <w:jc w:val="center"/>
+        <w:tblLook w:firstColumn="1" w:firstRow="1" w:lastColumn="0" w:lastRow="0" w:noHBand="0" w:noVBand="1" w:val="04A0"/>
+      </w:tblPr>
+      <w:tblGrid>
+        <w:gridCol w:w="2882"/>
+        <w:gridCol w:w="2882"/>
+        <w:gridCol w:w="2882"/>
+      </w:tblGrid>
+      <w:tr>
+        <w:tc>
+          <w:tcPr>
+            <w:tcW w:type="dxa" w:w="1361"/>
+          </w:tcPr>
+          <w:p>
+            <w:r/>
+            <w:r>
+              <w:rPr>
+                <w:rFonts w:ascii="Calibri" w:hAnsi="Calibri" w:eastAsia="黑体"/>
+                <w:b/>
+                <w:sz w:val="21"/>
+              </w:rPr>
+            </w:r>
+          </w:p>
+        </w:tc>
+        <w:tc>
+          <w:tcPr>
+            <w:tcW w:type="dxa" w:w="3855"/>
+          </w:tcPr>
+          <w:p>
+            <w:r/>
+            <w:r>
+              <w:rPr>
+                <w:rFonts w:ascii="Calibri" w:hAnsi="Calibri" w:eastAsia="黑体"/>
+                <w:b/>
+                <w:sz w:val="21"/>
+              </w:rPr>
+              <w:t>计产（本报告目标）</w:t>
+            </w:r>
+          </w:p>
+        </w:tc>
+        <w:tc>
+          <w:tcPr>
+            <w:tcW w:type="dxa" w:w="3855"/>
+          </w:tcPr>
+          <w:p>
+            <w:r/>
+            <w:r>
+              <w:rPr>
+                <w:rFonts w:ascii="Calibri" w:hAnsi="Calibri" w:eastAsia="黑体"/>
+                <w:b/>
+                <w:sz w:val="21"/>
+              </w:rPr>
+              <w:t>产量预测（不是目标）</w:t>
+            </w:r>
+          </w:p>
+        </w:tc>
+      </w:tr>
+      <w:tr>
+        <w:tc>
+          <w:tcPr>
+            <w:tcW w:type="dxa" w:w="1361"/>
+          </w:tcPr>
+          <w:p>
+            <w:r/>
+            <w:r>
+              <w:rPr>
+                <w:rFonts w:ascii="Calibri" w:hAnsi="Calibri" w:eastAsia="宋体"/>
+                <w:sz w:val="20"/>
+              </w:rPr>
+              <w:t>问题</w:t>
+            </w:r>
+          </w:p>
+        </w:tc>
+        <w:tc>
+          <w:tcPr>
+            <w:tcW w:type="dxa" w:w="3855"/>
+          </w:tcPr>
+          <w:p>
+            <w:r/>
+            <w:r>
+              <w:rPr>
+                <w:rFonts w:ascii="Calibri" w:hAnsi="Calibri" w:eastAsia="宋体"/>
+                <w:sz w:val="20"/>
+              </w:rPr>
+              <w:t>这口井现在产多少？</w:t>
+            </w:r>
+          </w:p>
+        </w:tc>
+        <w:tc>
+          <w:tcPr>
+            <w:tcW w:type="dxa" w:w="3855"/>
+          </w:tcPr>
+          <w:p>
+            <w:r/>
+            <w:r>
+              <w:rPr>
+                <w:rFonts w:ascii="Calibri" w:hAnsi="Calibri" w:eastAsia="宋体"/>
+                <w:sz w:val="20"/>
+              </w:rPr>
+              <w:t>未来一周/一月产多少？</w:t>
+            </w:r>
+          </w:p>
+        </w:tc>
+      </w:tr>
+      <w:tr>
+        <w:tc>
+          <w:tcPr>
+            <w:tcW w:type="dxa" w:w="1361"/>
+          </w:tcPr>
+          <w:p>
+            <w:r/>
+            <w:r>
+              <w:rPr>
+                <w:rFonts w:ascii="Calibri" w:hAnsi="Calibri" w:eastAsia="宋体"/>
+                <w:sz w:val="20"/>
+              </w:rPr>
+              <w:t>输入</w:t>
+            </w:r>
+          </w:p>
+        </w:tc>
+        <w:tc>
+          <w:tcPr>
+            <w:tcW w:type="dxa" w:w="3855"/>
+          </w:tcPr>
+          <w:p>
+            <w:r/>
+            <w:r>
+              <w:rPr>
+                <w:rFonts w:ascii="Calibri" w:hAnsi="Calibri" w:eastAsia="宋体"/>
+                <w:sz w:val="20"/>
+              </w:rPr>
+              <w:t>当前泵工况（转速、扭矩、电流、压温…）</w:t>
+            </w:r>
+          </w:p>
+        </w:tc>
+        <w:tc>
+          <w:tcPr>
+            <w:tcW w:type="dxa" w:w="3855"/>
+          </w:tcPr>
+          <w:p>
+            <w:r/>
+            <w:r>
+              <w:rPr>
+                <w:rFonts w:ascii="Calibri" w:hAnsi="Calibri" w:eastAsia="宋体"/>
+                <w:sz w:val="20"/>
+              </w:rPr>
+              <w:t>历史产量序列</w:t>
+            </w:r>
+          </w:p>
+        </w:tc>
+      </w:tr>
+      <w:tr>
+        <w:tc>
+          <w:tcPr>
+            <w:tcW w:type="dxa" w:w="1361"/>
+          </w:tcPr>
+          <w:p>
+            <w:r/>
+            <w:r>
+              <w:rPr>
+                <w:rFonts w:ascii="Calibri" w:hAnsi="Calibri" w:eastAsia="宋体"/>
+                <w:sz w:val="20"/>
+              </w:rPr>
+              <w:t>输出</w:t>
+            </w:r>
+          </w:p>
+        </w:tc>
+        <w:tc>
+          <w:tcPr>
+            <w:tcW w:type="dxa" w:w="3855"/>
+          </w:tcPr>
+          <w:p>
+            <w:r/>
+            <w:r>
+              <w:rPr>
+                <w:rFonts w:ascii="Calibri" w:hAnsi="Calibri" w:eastAsia="宋体"/>
+                <w:sz w:val="20"/>
+              </w:rPr>
+              <w:t>当前油/液产量</w:t>
+            </w:r>
+          </w:p>
+        </w:tc>
+        <w:tc>
+          <w:tcPr>
+            <w:tcW w:type="dxa" w:w="3855"/>
+          </w:tcPr>
+          <w:p>
+            <w:r/>
+            <w:r>
+              <w:rPr>
+                <w:rFonts w:ascii="Calibri" w:hAnsi="Calibri" w:eastAsia="宋体"/>
+                <w:sz w:val="20"/>
+              </w:rPr>
+              <w:t>未来产量</w:t>
+            </w:r>
+          </w:p>
+        </w:tc>
+      </w:tr>
+      <w:tr>
+        <w:tc>
+          <w:tcPr>
+            <w:tcW w:type="dxa" w:w="1361"/>
+          </w:tcPr>
+          <w:p>
+            <w:r/>
+            <w:r>
+              <w:rPr>
+                <w:rFonts w:ascii="Calibri" w:hAnsi="Calibri" w:eastAsia="宋体"/>
+                <w:sz w:val="20"/>
+              </w:rPr>
+              <w:t>用途</w:t>
+            </w:r>
+          </w:p>
+        </w:tc>
+        <w:tc>
+          <w:tcPr>
+            <w:tcW w:type="dxa" w:w="3855"/>
+          </w:tcPr>
+          <w:p>
+            <w:r/>
+            <w:r>
+              <w:rPr>
+                <w:rFonts w:ascii="Calibri" w:hAnsi="Calibri" w:eastAsia="宋体"/>
+                <w:sz w:val="20"/>
+              </w:rPr>
+              <w:t>替代/补充流量计、试井间隔内连续计量</w:t>
+            </w:r>
+          </w:p>
+        </w:tc>
+        <w:tc>
+          <w:tcPr>
+            <w:tcW w:type="dxa" w:w="3855"/>
+          </w:tcPr>
+          <w:p>
+            <w:r/>
+            <w:r>
+              <w:rPr>
+                <w:rFonts w:ascii="Calibri" w:hAnsi="Calibri" w:eastAsia="宋体"/>
+                <w:sz w:val="20"/>
+              </w:rPr>
+              <w:t>产量规划、递减分析</w:t>
+            </w:r>
+          </w:p>
+        </w:tc>
+      </w:tr>
+    </w:tbl>
+    <w:p/>
+    <w:p>
+      <w:pPr>
+        <w:spacing w:after="120"/>
+        <w:ind w:firstLine="420"/>
+      </w:pPr>
+      <w:r>
+        <w:rPr>
+          <w:rFonts w:ascii="Calibri" w:hAnsi="Calibri" w:eastAsia="宋体"/>
+          <w:b w:val="0"/>
+          <w:sz w:val="21"/>
+        </w:rPr>
+        <w:t>本报告只讨论计产。第三章以后的开源迁移，全部是「当前工况 → 当前产量」。</w:t>
+      </w:r>
+    </w:p>
+    <w:p>
+      <w:pPr>
+        <w:pStyle w:val="Heading2"/>
+      </w:pPr>
+      <w:r>
+        <w:rPr>
+          <w:rFonts w:ascii="Calibri" w:hAnsi="Calibri" w:eastAsia="黑体"/>
+          <w:b/>
+          <w:color w:val="1F4E79"/>
+          <w:sz w:val="26"/>
+        </w:rPr>
+        <w:t>2.2 为什么螺杆泵井要单独建计产模型</w:t>
+      </w:r>
+    </w:p>
+    <w:p>
+      <w:pPr>
+        <w:spacing w:after="120"/>
+        <w:ind w:firstLine="420"/>
+      </w:pPr>
+      <w:r>
+        <w:rPr>
+          <w:rFonts w:ascii="Calibri" w:hAnsi="Calibri" w:eastAsia="宋体"/>
+          <w:b w:val="0"/>
+          <w:sz w:val="21"/>
+        </w:rPr>
+        <w:t>自喷井/气举井产量主要由井口油嘴控制，计产信息源是油嘴尺寸与油嘴前后压差；螺杆泵井产量由泵控制，井口通常没有可调油嘴，计产信息源是转速、扭矩/电流以及泵两端压差。把自喷井油嘴计产模型直接套过来是错的。</w:t>
+      </w:r>
+    </w:p>
+    <w:p>
+      <w:pPr>
+        <w:pStyle w:val="Heading2"/>
+      </w:pPr>
+      <w:r>
+        <w:rPr>
+          <w:rFonts w:ascii="Calibri" w:hAnsi="Calibri" w:eastAsia="黑体"/>
+          <w:b/>
+          <w:color w:val="1F4E79"/>
+          <w:sz w:val="26"/>
+        </w:rPr>
+        <w:t>2.3 机理计产概论：流动链 + 三个辅助模型</w:t>
+      </w:r>
+    </w:p>
+    <w:p>
+      <w:pPr>
+        <w:spacing w:after="120"/>
+        <w:ind w:firstLine="420"/>
+      </w:pPr>
+      <w:r>
+        <w:rPr>
+          <w:rFonts w:ascii="Calibri" w:hAnsi="Calibri" w:eastAsia="宋体"/>
+          <w:b w:val="0"/>
+          <w:sz w:val="21"/>
+        </w:rPr>
+        <w:t>流动路径：地层 → 泵吸入口 → 螺杆泵（增压）→ 油管井筒 → 井口 → 地面。稳态时各段流量相同、压力在接点连续。把各段「压力–流量」约束联立求解，得到的工作点流量就是产量。三个辅助模型分工：</w:t>
+      </w:r>
+    </w:p>
+    <w:tbl>
+      <w:tblPr>
+        <w:tblStyle w:val="LightGrid-Accent1"/>
+        <w:tblW w:type="auto" w:w="0"/>
+        <w:jc w:val="center"/>
+        <w:tblLook w:firstColumn="1" w:firstRow="1" w:lastColumn="0" w:lastRow="0" w:noHBand="0" w:noVBand="1" w:val="04A0"/>
+      </w:tblPr>
+      <w:tblGrid>
+        <w:gridCol w:w="2161"/>
+        <w:gridCol w:w="2161"/>
+        <w:gridCol w:w="2161"/>
+        <w:gridCol w:w="2161"/>
+      </w:tblGrid>
+      <w:tr>
+        <w:tc>
+          <w:tcPr>
+            <w:tcW w:type="dxa" w:w="1928"/>
+          </w:tcPr>
+          <w:p>
+            <w:r/>
+            <w:r>
+              <w:rPr>
+                <w:rFonts w:ascii="Calibri" w:hAnsi="Calibri" w:eastAsia="黑体"/>
+                <w:b/>
+                <w:sz w:val="21"/>
+              </w:rPr>
+              <w:t>辅助模型</w:t>
+            </w:r>
+          </w:p>
+        </w:tc>
+        <w:tc>
+          <w:tcPr>
+            <w:tcW w:type="dxa" w:w="1701"/>
+          </w:tcPr>
+          <w:p>
+            <w:r/>
+            <w:r>
+              <w:rPr>
+                <w:rFonts w:ascii="Calibri" w:hAnsi="Calibri" w:eastAsia="黑体"/>
+                <w:b/>
+                <w:sz w:val="21"/>
+              </w:rPr>
+              <w:t>管哪一段</w:t>
+            </w:r>
+          </w:p>
+        </w:tc>
+        <w:tc>
+          <w:tcPr>
+            <w:tcW w:type="dxa" w:w="2835"/>
+          </w:tcPr>
+          <w:p>
+            <w:r/>
+            <w:r>
+              <w:rPr>
+                <w:rFonts w:ascii="Calibri" w:hAnsi="Calibri" w:eastAsia="黑体"/>
+                <w:b/>
+                <w:sz w:val="21"/>
+              </w:rPr>
+              <w:t>输入 → 输出</w:t>
+            </w:r>
+          </w:p>
+        </w:tc>
+        <w:tc>
+          <w:tcPr>
+            <w:tcW w:type="dxa" w:w="2608"/>
+          </w:tcPr>
+          <w:p>
+            <w:r/>
+            <w:r>
+              <w:rPr>
+                <w:rFonts w:ascii="Calibri" w:hAnsi="Calibri" w:eastAsia="黑体"/>
+                <w:b/>
+                <w:sz w:val="21"/>
+              </w:rPr>
+              <w:t>在计产中的作用</w:t>
+            </w:r>
+          </w:p>
+        </w:tc>
+      </w:tr>
+      <w:tr>
+        <w:tc>
+          <w:tcPr>
+            <w:tcW w:type="dxa" w:w="1928"/>
+          </w:tcPr>
+          <w:p>
+            <w:r/>
+            <w:r>
+              <w:rPr>
+                <w:rFonts w:ascii="Calibri" w:hAnsi="Calibri" w:eastAsia="宋体"/>
+                <w:sz w:val="20"/>
+              </w:rPr>
+              <w:t>螺杆泵运行特性模型（核心）</w:t>
+            </w:r>
+          </w:p>
+        </w:tc>
+        <w:tc>
+          <w:tcPr>
+            <w:tcW w:type="dxa" w:w="1701"/>
+          </w:tcPr>
+          <w:p>
+            <w:r/>
+            <w:r>
+              <w:rPr>
+                <w:rFonts w:ascii="Calibri" w:hAnsi="Calibri" w:eastAsia="宋体"/>
+                <w:sz w:val="20"/>
+              </w:rPr>
+              <w:t>泵段</w:t>
+            </w:r>
+          </w:p>
+        </w:tc>
+        <w:tc>
+          <w:tcPr>
+            <w:tcW w:type="dxa" w:w="2835"/>
+          </w:tcPr>
+          <w:p>
+            <w:r/>
+            <w:r>
+              <w:rPr>
+                <w:rFonts w:ascii="Calibri" w:hAnsi="Calibri" w:eastAsia="宋体"/>
+                <w:sz w:val="20"/>
+              </w:rPr>
+              <w:t>转速、泵压差、黏度、泵几何 → 实际排量、扭矩</w:t>
+            </w:r>
+          </w:p>
+        </w:tc>
+        <w:tc>
+          <w:tcPr>
+            <w:tcW w:type="dxa" w:w="2608"/>
+          </w:tcPr>
+          <w:p>
+            <w:r/>
+            <w:r>
+              <w:rPr>
+                <w:rFonts w:ascii="Calibri" w:hAnsi="Calibri" w:eastAsia="宋体"/>
+                <w:sz w:val="20"/>
+              </w:rPr>
+              <w:t>直接给出产量：Q = Q理论 − Q滑脱；是「计量元件」</w:t>
+            </w:r>
+          </w:p>
+        </w:tc>
+      </w:tr>
+      <w:tr>
+        <w:tc>
+          <w:tcPr>
+            <w:tcW w:type="dxa" w:w="1928"/>
+          </w:tcPr>
+          <w:p>
+            <w:r/>
+            <w:r>
+              <w:rPr>
+                <w:rFonts w:ascii="Calibri" w:hAnsi="Calibri" w:eastAsia="宋体"/>
+                <w:sz w:val="20"/>
+              </w:rPr>
+              <w:t>井筒流体运移模型（辅助）</w:t>
+            </w:r>
+          </w:p>
+        </w:tc>
+        <w:tc>
+          <w:tcPr>
+            <w:tcW w:type="dxa" w:w="1701"/>
+          </w:tcPr>
+          <w:p>
+            <w:r/>
+            <w:r>
+              <w:rPr>
+                <w:rFonts w:ascii="Calibri" w:hAnsi="Calibri" w:eastAsia="宋体"/>
+                <w:sz w:val="20"/>
+              </w:rPr>
+              <w:t>泵出口→井口油管（及环空液柱）</w:t>
+            </w:r>
+          </w:p>
+        </w:tc>
+        <w:tc>
+          <w:tcPr>
+            <w:tcW w:type="dxa" w:w="2835"/>
+          </w:tcPr>
+          <w:p>
+            <w:r/>
+            <w:r>
+              <w:rPr>
+                <w:rFonts w:ascii="Calibri" w:hAnsi="Calibri" w:eastAsia="宋体"/>
+                <w:sz w:val="20"/>
+              </w:rPr>
+              <w:t>流量、边界压力、管径井斜、PVT → 沿程压力/温度/持液率</w:t>
+            </w:r>
+          </w:p>
+        </w:tc>
+        <w:tc>
+          <w:tcPr>
+            <w:tcW w:type="dxa" w:w="2608"/>
+          </w:tcPr>
+          <w:p>
+            <w:r/>
+            <w:r>
+              <w:rPr>
+                <w:rFonts w:ascii="Calibri" w:hAnsi="Calibri" w:eastAsia="宋体"/>
+                <w:sz w:val="20"/>
+              </w:rPr>
+              <w:t>算出泵出口压力或回压，从而得到泵压差</w:t>
+            </w:r>
+          </w:p>
+        </w:tc>
+      </w:tr>
+      <w:tr>
+        <w:tc>
+          <w:tcPr>
+            <w:tcW w:type="dxa" w:w="1928"/>
+          </w:tcPr>
+          <w:p>
+            <w:r/>
+            <w:r>
+              <w:rPr>
+                <w:rFonts w:ascii="Calibri" w:hAnsi="Calibri" w:eastAsia="宋体"/>
+                <w:sz w:val="20"/>
+              </w:rPr>
+              <w:t>井筒流体摩阻计算模型（辅助）</w:t>
+            </w:r>
+          </w:p>
+        </w:tc>
+        <w:tc>
+          <w:tcPr>
+            <w:tcW w:type="dxa" w:w="1701"/>
+          </w:tcPr>
+          <w:p>
+            <w:r/>
+            <w:r>
+              <w:rPr>
+                <w:rFonts w:ascii="Calibri" w:hAnsi="Calibri" w:eastAsia="宋体"/>
+                <w:sz w:val="20"/>
+              </w:rPr>
+              <w:t>运移模型内部的摩阻压降项</w:t>
+            </w:r>
+          </w:p>
+        </w:tc>
+        <w:tc>
+          <w:tcPr>
+            <w:tcW w:type="dxa" w:w="2835"/>
+          </w:tcPr>
+          <w:p>
+            <w:r/>
+            <w:r>
+              <w:rPr>
+                <w:rFonts w:ascii="Calibri" w:hAnsi="Calibri" w:eastAsia="宋体"/>
+                <w:sz w:val="20"/>
+              </w:rPr>
+              <w:t>流速、管径、粗糙度、物性 → ΔP摩阻</w:t>
+            </w:r>
+          </w:p>
+        </w:tc>
+        <w:tc>
+          <w:tcPr>
+            <w:tcW w:type="dxa" w:w="2608"/>
+          </w:tcPr>
+          <w:p>
+            <w:r/>
+            <w:r>
+              <w:rPr>
+                <w:rFonts w:ascii="Calibri" w:hAnsi="Calibri" w:eastAsia="宋体"/>
+                <w:sz w:val="20"/>
+              </w:rPr>
+              <w:t>运移模型的组成部分，影响泵压差精度</w:t>
+            </w:r>
+          </w:p>
+        </w:tc>
+      </w:tr>
+    </w:tbl>
+    <w:p/>
+    <w:p>
+      <w:pPr>
+        <w:spacing w:after="120"/>
+        <w:ind w:firstLine="420"/>
+      </w:pPr>
+      <w:r>
+        <w:rPr>
+          <w:rFonts w:ascii="Calibri" w:hAnsi="Calibri" w:eastAsia="宋体"/>
+          <w:b w:val="0"/>
+          <w:sz w:val="21"/>
+        </w:rPr>
+        <w:t>一句话：运移是井筒总框架，摩阻是运移内部的一块，泵特性是链条上的增压与计量核心。三者一起用；神经网络可以学整条映射，也可以只学其中的滑脱项。</w:t>
+      </w:r>
+    </w:p>
+    <w:p>
+      <w:pPr>
+        <w:pStyle w:val="Heading2"/>
+      </w:pPr>
+      <w:r>
+        <w:rPr>
+          <w:rFonts w:ascii="Calibri" w:hAnsi="Calibri" w:eastAsia="黑体"/>
+          <w:b/>
+          <w:color w:val="1F4E79"/>
+          <w:sz w:val="26"/>
+        </w:rPr>
+        <w:t>2.4 机理计产求解流程（六步）</w:t>
+      </w:r>
+    </w:p>
+    <w:p>
+      <w:pPr>
+        <w:spacing w:after="120"/>
+        <w:ind w:firstLine="420"/>
+      </w:pPr>
+      <w:r>
+        <w:rPr>
+          <w:rFonts w:ascii="Calibri" w:hAnsi="Calibri" w:eastAsia="宋体"/>
+          <w:b w:val="0"/>
+          <w:sz w:val="21"/>
+        </w:rPr>
+        <w:t>以「已知转速与井口压力、求产量」为例（稳态节点分析）：</w:t>
+      </w:r>
+    </w:p>
+    <w:p>
+      <w:pPr>
+        <w:pStyle w:val="ListBullet"/>
+        <w:spacing w:after="60"/>
+      </w:pPr>
+      <w:r>
+        <w:rPr>
+          <w:rFonts w:ascii="Calibri" w:hAnsi="Calibri" w:eastAsia="宋体"/>
+          <w:b/>
+          <w:sz w:val="21"/>
+        </w:rPr>
+        <w:t xml:space="preserve">步骤 1 — </w:t>
+      </w:r>
+      <w:r>
+        <w:rPr>
+          <w:rFonts w:ascii="Calibri" w:hAnsi="Calibri" w:eastAsia="宋体"/>
+          <w:sz w:val="21"/>
+        </w:rPr>
+        <w:t>准备输入：泵几何（转子直径、偏心距、导程、级数）、当前转速、井口油压、流体物性（密度、黏度、含水、气油比）、井身与泵挂深度。</w:t>
+      </w:r>
+    </w:p>
+    <w:p>
+      <w:pPr>
+        <w:pStyle w:val="ListBullet"/>
+        <w:spacing w:after="60"/>
+      </w:pPr>
+      <w:r>
+        <w:rPr>
+          <w:rFonts w:ascii="Calibri" w:hAnsi="Calibri" w:eastAsia="宋体"/>
+          <w:b/>
+          <w:sz w:val="21"/>
+        </w:rPr>
+        <w:t xml:space="preserve">步骤 2 — </w:t>
+      </w:r>
+      <w:r>
+        <w:rPr>
+          <w:rFonts w:ascii="Calibri" w:hAnsi="Calibri" w:eastAsia="宋体"/>
+          <w:sz w:val="21"/>
+        </w:rPr>
+        <w:t>假设一个试探产量 Q。</w:t>
+      </w:r>
+    </w:p>
+    <w:p>
+      <w:pPr>
+        <w:pStyle w:val="ListBullet"/>
+        <w:spacing w:after="60"/>
+      </w:pPr>
+      <w:r>
+        <w:rPr>
+          <w:rFonts w:ascii="Calibri" w:hAnsi="Calibri" w:eastAsia="宋体"/>
+          <w:b/>
+          <w:sz w:val="21"/>
+        </w:rPr>
+        <w:t xml:space="preserve">步骤 3 — </w:t>
+      </w:r>
+      <w:r>
+        <w:rPr>
+          <w:rFonts w:ascii="Calibri" w:hAnsi="Calibri" w:eastAsia="宋体"/>
+          <w:sz w:val="21"/>
+        </w:rPr>
+        <w:t>用井筒运移模型（内部调用摩阻计算）从井口往下积分到泵出口，得到泵出口压力 P_out；结合吸入口压力传感器或动液面得到 P_in；泵压差 ΔP = P_out − P_in。</w:t>
+      </w:r>
+    </w:p>
+    <w:p>
+      <w:pPr>
+        <w:pStyle w:val="ListBullet"/>
+        <w:spacing w:after="60"/>
+      </w:pPr>
+      <w:r>
+        <w:rPr>
+          <w:rFonts w:ascii="Calibri" w:hAnsi="Calibri" w:eastAsia="宋体"/>
+          <w:b/>
+          <w:sz w:val="21"/>
+        </w:rPr>
+        <w:t xml:space="preserve">步骤 4 — </w:t>
+      </w:r>
+      <w:r>
+        <w:rPr>
+          <w:rFonts w:ascii="Calibri" w:hAnsi="Calibri" w:eastAsia="宋体"/>
+          <w:sz w:val="21"/>
+        </w:rPr>
+        <w:t>用螺杆泵特性模型：理论排量 Q_th = C × 转速；滑脱量 Q_slip = f(ΔP, 黏度, 间隙…)；泵实际排量 Q_pump = Q_th − Q_slip。</w:t>
+      </w:r>
+    </w:p>
+    <w:p>
+      <w:pPr>
+        <w:pStyle w:val="ListBullet"/>
+        <w:spacing w:after="60"/>
+      </w:pPr>
+      <w:r>
+        <w:rPr>
+          <w:rFonts w:ascii="Calibri" w:hAnsi="Calibri" w:eastAsia="宋体"/>
+          <w:b/>
+          <w:sz w:val="21"/>
+        </w:rPr>
+        <w:t xml:space="preserve">步骤 5 — </w:t>
+      </w:r>
+      <w:r>
+        <w:rPr>
+          <w:rFonts w:ascii="Calibri" w:hAnsi="Calibri" w:eastAsia="宋体"/>
+          <w:sz w:val="21"/>
+        </w:rPr>
+        <w:t>比较 Q_pump 与假设的 Q；不一致则修正假设回到步骤 3；一致则该 Q 即为当前产量。</w:t>
+      </w:r>
+    </w:p>
+    <w:p>
+      <w:pPr>
+        <w:pStyle w:val="ListBullet"/>
+        <w:spacing w:after="60"/>
+      </w:pPr>
+      <w:r>
+        <w:rPr>
+          <w:rFonts w:ascii="Calibri" w:hAnsi="Calibri" w:eastAsia="宋体"/>
+          <w:b/>
+          <w:sz w:val="21"/>
+        </w:rPr>
+        <w:t xml:space="preserve">步骤 6 — </w:t>
+      </w:r>
+      <w:r>
+        <w:rPr>
+          <w:rFonts w:ascii="Calibri" w:hAnsi="Calibri" w:eastAsia="宋体"/>
+          <w:sz w:val="21"/>
+        </w:rPr>
+        <w:t>（可选）用流入动态 IPR 校核：泵吸入口压力对应的地层供液能力应与 Q 匹配。</w:t>
+      </w:r>
+    </w:p>
+    <w:p>
+      <w:pPr>
+        <w:spacing w:after="120"/>
+        <w:ind w:firstLine="420"/>
+      </w:pPr>
+      <w:r>
+        <w:rPr>
+          <w:rFonts w:ascii="Calibri" w:hAnsi="Calibri" w:eastAsia="宋体"/>
+          <w:b w:val="0"/>
+          <w:sz w:val="21"/>
+        </w:rPr>
+        <w:t>开源环境下：步骤 3 可用 flotech / marlim3（见第五章）；步骤 4 需按论文自写泵特性公式。神经网络计产等于用数据直接拟合「转速、扭矩/电流、井口压、沉没度… → Q」；混合结构则固定 Q_th = C×n，只让网络学 Q_slip（见第四章结构 B）。</w:t>
+      </w:r>
+    </w:p>
+    <w:p>
+      <w:pPr>
+        <w:pStyle w:val="Heading2"/>
+      </w:pPr>
+      <w:r>
+        <w:rPr>
+          <w:rFonts w:ascii="Calibri" w:hAnsi="Calibri" w:eastAsia="黑体"/>
+          <w:b/>
+          <w:color w:val="1F4E79"/>
+          <w:sz w:val="26"/>
+        </w:rPr>
+        <w:t>2.5 为何还要神经网络</w:t>
+      </w:r>
+    </w:p>
+    <w:p>
+      <w:pPr>
+        <w:spacing w:after="120"/>
+        <w:ind w:firstLine="420"/>
+      </w:pPr>
+      <w:r>
+        <w:rPr>
+          <w:rFonts w:ascii="Calibri" w:hAnsi="Calibri" w:eastAsia="宋体"/>
+          <w:b w:val="0"/>
+          <w:sz w:val="21"/>
+        </w:rPr>
+        <w:t>机理计产的薄弱环节是滑脱量——受定子磨损、温度、黏度、间隙非线性变化影响，解析公式难以长期准确。神经网络用试井样本拟合这条映射，可吃掉机理算不准的部分；与机理公式结合（结构 B）时，既保留物理外推，又提高现场精度。</w:t>
+      </w:r>
+    </w:p>
+    <w:p>
+      <w:pPr>
+        <w:pStyle w:val="Heading1"/>
+      </w:pPr>
+      <w:r>
+        <w:rPr>
+          <w:rFonts w:ascii="Calibri" w:hAnsi="Calibri" w:eastAsia="黑体"/>
+          <w:b/>
+          <w:color w:val="1F4E79"/>
+          <w:sz w:val="32"/>
+        </w:rPr>
+        <w:t>三、相关开源模型（按迁移优先级）</w:t>
+      </w:r>
+    </w:p>
+    <w:p>
+      <w:pPr>
+        <w:spacing w:after="120"/>
+        <w:ind w:firstLine="420"/>
+      </w:pPr>
+      <w:r>
+        <w:rPr>
+          <w:rFonts w:ascii="Calibri" w:hAnsi="Calibri" w:eastAsia="宋体"/>
+          <w:b w:val="0"/>
+          <w:sz w:val="21"/>
+        </w:rPr>
+        <w:t>下表只列「能拿来改成螺杆泵井计产」的开源。与计产无关的（故障诊断、几何设计、资产管理）放在第七章附录。</w:t>
       </w:r>
     </w:p>
     <w:tbl>
@@ -690,7 +1530,7 @@
           <w:color w:val="1F4E79"/>
           <w:sz w:val="32"/>
         </w:rPr>
-        <w:t>三、怎么迁移（按步骤做）</w:t>
+        <w:t>四、怎么迁移（按步骤做）</w:t>
       </w:r>
     </w:p>
     <w:p>
@@ -704,7 +1544,7 @@
           <w:color w:val="1F4E79"/>
           <w:sz w:val="26"/>
         </w:rPr>
-        <w:t>3.1 迁移对照：原模型 → 螺杆泵井</w:t>
+        <w:t>4.1 迁移对照：原模型 → 螺杆泵井</w:t>
       </w:r>
     </w:p>
     <w:tbl>
@@ -970,7 +1810,7 @@
           <w:color w:val="1F4E79"/>
           <w:sz w:val="26"/>
         </w:rPr>
-        <w:t>3.2 推荐特征（螺杆泵井）</w:t>
+        <w:t>4.2 推荐特征（螺杆泵井）</w:t>
       </w:r>
     </w:p>
     <w:tbl>
@@ -1330,7 +2170,7 @@
           <w:color w:val="1F4E79"/>
           <w:sz w:val="26"/>
         </w:rPr>
-        <w:t>3.3 两种迁移结构（选一种）</w:t>
+        <w:t>4.3 两种迁移结构（选一种）</w:t>
       </w:r>
     </w:p>
     <w:p>
@@ -1400,7 +2240,7 @@
           <w:color w:val="1F4E79"/>
           <w:sz w:val="26"/>
         </w:rPr>
-        <w:t>3.4 具体操作清单（建议从第 1 项开源改起）</w:t>
+        <w:t>4.4 具体操作清单（建议从第 1 项开源改起）</w:t>
       </w:r>
     </w:p>
     <w:p>
@@ -1519,7 +2359,7 @@
           <w:color w:val="1F4E79"/>
           <w:sz w:val="26"/>
         </w:rPr>
-        <w:t>3.5 迁移时常见坑</w:t>
+        <w:t>4.5 迁移时常见坑</w:t>
       </w:r>
     </w:p>
     <w:p>
@@ -1585,7 +2425,7 @@
           <w:color w:val="1F4E79"/>
           <w:sz w:val="32"/>
         </w:rPr>
-        <w:t>四、辅助工具（算泵压差时用，不是 NN 本身）</w:t>
+        <w:t>五、辅助工具（算泵压差时用，不是 NN 本身）</w:t>
       </w:r>
     </w:p>
     <w:p>
@@ -1775,7 +2615,7 @@
           <w:color w:val="1F4E79"/>
           <w:sz w:val="32"/>
         </w:rPr>
-        <w:t>五、你现在该做什么</w:t>
+        <w:t>六、你现在该做什么</w:t>
       </w:r>
     </w:p>
     <w:p>
@@ -1817,7 +2657,7 @@
           <w:rFonts w:ascii="Calibri" w:hAnsi="Calibri" w:eastAsia="宋体"/>
           <w:sz w:val="21"/>
         </w:rPr>
-        <w:t>导出本井「泵参数 + 试井产量」对齐表，按 3.2 列好特征。</w:t>
+        <w:t>导出本井「泵参数 + 试井产量」对齐表，按 4.2 列好特征。</w:t>
       </w:r>
     </w:p>
     <w:p>
@@ -1866,7 +2706,7 @@
           <w:color w:val="1F4E79"/>
           <w:sz w:val="32"/>
         </w:rPr>
-        <w:t>六、附录：螺杆泵相关开源（非计产，勿与第二章混淆）</w:t>
+        <w:t>七、附录：螺杆泵相关开源（非计产，勿与第三章混淆）</w:t>
       </w:r>
     </w:p>
     <w:p>
@@ -2285,7 +3125,7 @@
           <w:b w:val="0"/>
           <w:sz w:val="21"/>
         </w:rPr>
-        <w:t>若业务同时需要「计产 + 故障诊断」，可并行使用：计产走第二章迁移路径；故障诊断可参考 pump_ai_software 的控制图与预警思路。二者输入传感器有重叠（转速、扭矩、电流），但训练标签不同（产量 vs 故障类别），不能混成一个模型。</w:t>
+        <w:t>若业务同时需要「计产 + 故障诊断」，可并行使用：计产走第三章开源 + 第四章迁移；故障诊断可参考 pump_ai_software 的控制图与预警思路。二者输入传感器有重叠（转速、扭矩、电流），但训练标签不同（产量 vs 故障类别），不能混成一个模型。</w:t>
       </w:r>
     </w:p>
     <w:sectPr>

</xml_diff>